<commit_message>
feat(sync): synchronize spatial intent grounding, manuscripts, tests, and complete postgresql backup before migration
</commit_message>
<xml_diff>
--- a/jurnal/DRAFT_JURNAL_ILMIAH_INDONESIA.docx
+++ b/jurnal/DRAFT_JURNAL_ILMIAH_INDONESIA.docx
@@ -2,7 +2,7 @@
 <file path=word/document.xml><?xml version="1.0" encoding="utf-8"?>
 <w:document xmlns:w="http://schemas.openxmlformats.org/wordprocessingml/2006/main" xmlns:m="http://schemas.openxmlformats.org/officeDocument/2006/math" xmlns:r="http://schemas.openxmlformats.org/officeDocument/2006/relationships" xmlns:o="urn:schemas-microsoft-com:office:office" xmlns:v="urn:schemas-microsoft-com:vml" xmlns:w10="urn:schemas-microsoft-com:office:word" xmlns:a="http://schemas.openxmlformats.org/drawingml/2006/main" xmlns:pic="http://schemas.openxmlformats.org/drawingml/2006/picture" xmlns:wp="http://schemas.openxmlformats.org/drawingml/2006/wordprocessingDrawing">
   <w:body>
-    <w:bookmarkStart w:id="60" w:name="X057767f2227e17558beda55987f36fc35fa9b7f"/>
+    <w:bookmarkStart w:id="61" w:name="X057767f2227e17558beda55987f36fc35fa9b7f"/>
     <w:p>
       <w:pPr>
         <w:pStyle w:val="Heading1"/>
@@ -4488,13 +4488,13 @@
       </w:r>
     </w:p>
     <w:bookmarkEnd w:id="30"/>
-    <w:bookmarkStart w:id="31" w:name="X5e5ad8893ebf59db58d40f6d93efec929f2ad97"/>
+    <w:bookmarkStart w:id="31" w:name="X32d7ac4ebc7d3345861a190005e12f2818731b3"/>
     <w:p>
       <w:pPr>
         <w:pStyle w:val="Heading3"/>
       </w:pPr>
       <w:r>
-        <w:t xml:space="preserve">2.4 Formulasi Komputasi Jarak Geodesik dan Topologi Rute Jaringan Jalan</w:t>
+        <w:t xml:space="preserve">2.4 Formulasi Komputasi Jarak Geodesik: Spherical Law of Cosines dan Haversine</w:t>
       </w:r>
     </w:p>
     <w:p>
@@ -4502,7 +4502,7 @@
         <w:pStyle w:val="FirstParagraph"/>
       </w:pPr>
       <w:r>
-        <w:t xml:space="preserve">Sistem membedakan secara tegas antara perhitungan kedekatan spasial linear dengan navigasi jalan raya:</w:t>
+        <w:t xml:space="preserve">Sistem membedakan secara tegas antara perhitungan kedekatan spasial geodesik relasional dengan navigasi jaringan jalan raya:</w:t>
       </w:r>
     </w:p>
     <w:p>
@@ -4517,139 +4517,29 @@
           <w:bCs/>
           <w:b/>
         </w:rPr>
-        <w:t xml:space="preserve">Jarak Geodesik Lingkaran Besar (Formula Haversine):</w:t>
+        <w:t xml:space="preserve">Jarak Geodesik Lingkaran Besar (</w:t>
+      </w:r>
+      <w:r>
+        <w:rPr>
+          <w:iCs/>
+          <w:i/>
+          <w:bCs/>
+          <w:b/>
+        </w:rPr>
+        <w:t xml:space="preserve">Great-Circle Distance</w:t>
+      </w:r>
+      <w:r>
+        <w:rPr>
+          <w:bCs/>
+          <w:b/>
+        </w:rPr>
+        <w:t xml:space="preserve">):</w:t>
       </w:r>
       <w:r>
         <w:br/>
       </w:r>
       <w:r>
-        <w:t xml:space="preserve">Diterapkan langsung di dalam kueri SQL PostgreSQL untuk menyaring ribuan baris koordinat secara sub-milidetik. Untuk koordinat pengguna</w:t>
-      </w:r>
-      <w:r>
-        <w:t xml:space="preserve"> </w:t>
-      </w:r>
-      <m:oMath>
-        <m:sSub>
-          <m:e>
-            <m:r>
-              <m:t>P</m:t>
-            </m:r>
-          </m:e>
-          <m:sub>
-            <m:r>
-              <m:t>1</m:t>
-            </m:r>
-          </m:sub>
-        </m:sSub>
-        <m:d>
-          <m:dPr>
-            <m:begChr m:val="("/>
-            <m:endChr m:val=")"/>
-            <m:sepChr m:val=""/>
-            <m:grow/>
-          </m:dPr>
-          <m:e>
-            <m:sSub>
-              <m:e>
-                <m:r>
-                  <m:t>ϕ</m:t>
-                </m:r>
-              </m:e>
-              <m:sub>
-                <m:r>
-                  <m:t>1</m:t>
-                </m:r>
-              </m:sub>
-            </m:sSub>
-            <m:r>
-              <m:rPr>
-                <m:sty m:val="p"/>
-              </m:rPr>
-              <m:t>,</m:t>
-            </m:r>
-            <m:sSub>
-              <m:e>
-                <m:r>
-                  <m:t>λ</m:t>
-                </m:r>
-              </m:e>
-              <m:sub>
-                <m:r>
-                  <m:t>1</m:t>
-                </m:r>
-              </m:sub>
-            </m:sSub>
-          </m:e>
-        </m:d>
-      </m:oMath>
-      <w:r>
-        <w:t xml:space="preserve"> </w:t>
-      </w:r>
-      <w:r>
-        <w:t xml:space="preserve">dan koordinat objek wisata</w:t>
-      </w:r>
-      <w:r>
-        <w:t xml:space="preserve"> </w:t>
-      </w:r>
-      <m:oMath>
-        <m:sSub>
-          <m:e>
-            <m:r>
-              <m:t>P</m:t>
-            </m:r>
-          </m:e>
-          <m:sub>
-            <m:r>
-              <m:t>2</m:t>
-            </m:r>
-          </m:sub>
-        </m:sSub>
-        <m:d>
-          <m:dPr>
-            <m:begChr m:val="("/>
-            <m:endChr m:val=")"/>
-            <m:sepChr m:val=""/>
-            <m:grow/>
-          </m:dPr>
-          <m:e>
-            <m:sSub>
-              <m:e>
-                <m:r>
-                  <m:t>ϕ</m:t>
-                </m:r>
-              </m:e>
-              <m:sub>
-                <m:r>
-                  <m:t>2</m:t>
-                </m:r>
-              </m:sub>
-            </m:sSub>
-            <m:r>
-              <m:rPr>
-                <m:sty m:val="p"/>
-              </m:rPr>
-              <m:t>,</m:t>
-            </m:r>
-            <m:sSub>
-              <m:e>
-                <m:r>
-                  <m:t>λ</m:t>
-                </m:r>
-              </m:e>
-              <m:sub>
-                <m:r>
-                  <m:t>2</m:t>
-                </m:r>
-              </m:sub>
-            </m:sSub>
-          </m:e>
-        </m:d>
-      </m:oMath>
-      <w:r>
-        <w:t xml:space="preserve"> </w:t>
-      </w:r>
-      <w:r>
-        <w:t xml:space="preserve">dengan jari-jari bumi</w:t>
+        <w:t xml:space="preserve">Untuk menyaring ribuan koordinat kandidat secara sub-milidetik pada PostgreSQL, sistem membandingkan dua formula trigonometri bola bumi dengan jari-jari rata-rata bumi</w:t>
       </w:r>
       <w:r>
         <w:t xml:space="preserve"> </w:t>
@@ -4676,385 +4566,28 @@
         </m:r>
       </m:oMath>
       <w:r>
-        <w:t xml:space="preserve"> </w:t>
-      </w:r>
-      <w:r>
-        <w:t xml:space="preserve">[12]:</w:t>
+        <w:t xml:space="preserve">:</w:t>
       </w:r>
     </w:p>
     <w:p>
       <w:pPr>
-        <w:pStyle w:val="BodyText"/>
-      </w:pPr>
-      <m:oMathPara>
-        <m:oMathParaPr>
-          <m:jc m:val="center"/>
-        </m:oMathParaPr>
-        <m:oMath>
-          <m:r>
-            <m:t>Δ</m:t>
-          </m:r>
-          <m:r>
-            <m:t>ϕ</m:t>
-          </m:r>
-          <m:r>
-            <m:rPr>
-              <m:sty m:val="p"/>
-            </m:rPr>
-            <m:t>=</m:t>
-          </m:r>
-          <m:sSub>
-            <m:e>
-              <m:r>
-                <m:t>ϕ</m:t>
-              </m:r>
-            </m:e>
-            <m:sub>
-              <m:r>
-                <m:t>2</m:t>
-              </m:r>
-            </m:sub>
-          </m:sSub>
-          <m:r>
-            <m:rPr>
-              <m:sty m:val="p"/>
-            </m:rPr>
-            <m:t>−</m:t>
-          </m:r>
-          <m:sSub>
-            <m:e>
-              <m:r>
-                <m:t>ϕ</m:t>
-              </m:r>
-            </m:e>
-            <m:sub>
-              <m:r>
-                <m:t>1</m:t>
-              </m:r>
-            </m:sub>
-          </m:sSub>
-          <m:r>
-            <m:rPr>
-              <m:sty m:val="p"/>
-            </m:rPr>
-            <m:t>,</m:t>
-          </m:r>
-          <m:r>
-            <m:t> </m:t>
-          </m:r>
-          <m:r>
-            <m:t>Δ</m:t>
-          </m:r>
-          <m:r>
-            <m:t>λ</m:t>
-          </m:r>
-          <m:r>
-            <m:rPr>
-              <m:sty m:val="p"/>
-            </m:rPr>
-            <m:t>=</m:t>
-          </m:r>
-          <m:sSub>
-            <m:e>
-              <m:r>
-                <m:t>λ</m:t>
-              </m:r>
-            </m:e>
-            <m:sub>
-              <m:r>
-                <m:t>2</m:t>
-              </m:r>
-            </m:sub>
-          </m:sSub>
-          <m:r>
-            <m:rPr>
-              <m:sty m:val="p"/>
-            </m:rPr>
-            <m:t>−</m:t>
-          </m:r>
-          <m:sSub>
-            <m:e>
-              <m:r>
-                <m:t>λ</m:t>
-              </m:r>
-            </m:e>
-            <m:sub>
-              <m:r>
-                <m:t>1</m:t>
-              </m:r>
-            </m:sub>
-          </m:sSub>
-        </m:oMath>
-      </m:oMathPara>
+        <w:numPr>
+          <w:ilvl w:val="1"/>
+          <w:numId w:val="1002"/>
+        </w:numPr>
+        <w:pStyle w:val="Compact"/>
+      </w:pPr>
+      <w:r>
+        <w:rPr>
+          <w:bCs/>
+          <w:b/>
+        </w:rPr>
+        <w:t xml:space="preserve">Formula Haversine Eksak:</w:t>
+      </w:r>
     </w:p>
     <w:p>
       <w:pPr>
-        <w:pStyle w:val="FirstParagraph"/>
-      </w:pPr>
-      <m:oMathPara>
-        <m:oMathParaPr>
-          <m:jc m:val="center"/>
-        </m:oMathParaPr>
-        <m:oMath>
-          <m:r>
-            <m:t>a</m:t>
-          </m:r>
-          <m:r>
-            <m:rPr>
-              <m:sty m:val="p"/>
-            </m:rPr>
-            <m:t>=</m:t>
-          </m:r>
-          <m:sSup>
-            <m:e>
-              <m:r>
-                <m:rPr>
-                  <m:sty m:val="p"/>
-                </m:rPr>
-                <m:t>sin</m:t>
-              </m:r>
-            </m:e>
-            <m:sup>
-              <m:r>
-                <m:t>2</m:t>
-              </m:r>
-            </m:sup>
-          </m:sSup>
-          <m:d>
-            <m:dPr>
-              <m:begChr m:val="("/>
-              <m:endChr m:val=")"/>
-              <m:sepChr m:val=""/>
-              <m:grow/>
-            </m:dPr>
-            <m:e>
-              <m:f>
-                <m:fPr>
-                  <m:type m:val="bar"/>
-                </m:fPr>
-                <m:num>
-                  <m:r>
-                    <m:t>Δ</m:t>
-                  </m:r>
-                  <m:r>
-                    <m:t>ϕ</m:t>
-                  </m:r>
-                </m:num>
-                <m:den>
-                  <m:r>
-                    <m:t>2</m:t>
-                  </m:r>
-                </m:den>
-              </m:f>
-            </m:e>
-          </m:d>
-          <m:r>
-            <m:rPr>
-              <m:sty m:val="p"/>
-            </m:rPr>
-            <m:t>+</m:t>
-          </m:r>
-          <m:r>
-            <m:rPr>
-              <m:sty m:val="p"/>
-            </m:rPr>
-            <m:t>cos</m:t>
-          </m:r>
-          <m:d>
-            <m:dPr>
-              <m:begChr m:val="("/>
-              <m:endChr m:val=")"/>
-              <m:sepChr m:val=""/>
-              <m:grow/>
-            </m:dPr>
-            <m:e>
-              <m:sSub>
-                <m:e>
-                  <m:r>
-                    <m:t>ϕ</m:t>
-                  </m:r>
-                </m:e>
-                <m:sub>
-                  <m:r>
-                    <m:t>1</m:t>
-                  </m:r>
-                </m:sub>
-              </m:sSub>
-            </m:e>
-          </m:d>
-          <m:r>
-            <m:rPr>
-              <m:sty m:val="p"/>
-            </m:rPr>
-            <m:t>⋅</m:t>
-          </m:r>
-          <m:r>
-            <m:rPr>
-              <m:sty m:val="p"/>
-            </m:rPr>
-            <m:t>cos</m:t>
-          </m:r>
-          <m:d>
-            <m:dPr>
-              <m:begChr m:val="("/>
-              <m:endChr m:val=")"/>
-              <m:sepChr m:val=""/>
-              <m:grow/>
-            </m:dPr>
-            <m:e>
-              <m:sSub>
-                <m:e>
-                  <m:r>
-                    <m:t>ϕ</m:t>
-                  </m:r>
-                </m:e>
-                <m:sub>
-                  <m:r>
-                    <m:t>2</m:t>
-                  </m:r>
-                </m:sub>
-              </m:sSub>
-            </m:e>
-          </m:d>
-          <m:r>
-            <m:rPr>
-              <m:sty m:val="p"/>
-            </m:rPr>
-            <m:t>⋅</m:t>
-          </m:r>
-          <m:sSup>
-            <m:e>
-              <m:r>
-                <m:rPr>
-                  <m:sty m:val="p"/>
-                </m:rPr>
-                <m:t>sin</m:t>
-              </m:r>
-            </m:e>
-            <m:sup>
-              <m:r>
-                <m:t>2</m:t>
-              </m:r>
-            </m:sup>
-          </m:sSup>
-          <m:d>
-            <m:dPr>
-              <m:begChr m:val="("/>
-              <m:endChr m:val=")"/>
-              <m:sepChr m:val=""/>
-              <m:grow/>
-            </m:dPr>
-            <m:e>
-              <m:f>
-                <m:fPr>
-                  <m:type m:val="bar"/>
-                </m:fPr>
-                <m:num>
-                  <m:r>
-                    <m:t>Δ</m:t>
-                  </m:r>
-                  <m:r>
-                    <m:t>λ</m:t>
-                  </m:r>
-                </m:num>
-                <m:den>
-                  <m:r>
-                    <m:t>2</m:t>
-                  </m:r>
-                </m:den>
-              </m:f>
-            </m:e>
-          </m:d>
-        </m:oMath>
-      </m:oMathPara>
-    </w:p>
-    <w:p>
-      <w:pPr>
-        <w:pStyle w:val="FirstParagraph"/>
-      </w:pPr>
-      <m:oMathPara>
-        <m:oMathParaPr>
-          <m:jc m:val="center"/>
-        </m:oMathParaPr>
-        <m:oMath>
-          <m:r>
-            <m:t>c</m:t>
-          </m:r>
-          <m:r>
-            <m:rPr>
-              <m:sty m:val="p"/>
-            </m:rPr>
-            <m:t>=</m:t>
-          </m:r>
-          <m:r>
-            <m:t>2</m:t>
-          </m:r>
-          <m:r>
-            <m:rPr>
-              <m:sty m:val="p"/>
-            </m:rPr>
-            <m:t>⋅</m:t>
-          </m:r>
-          <m:r>
-            <m:rPr>
-              <m:nor/>
-              <m:sty m:val="p"/>
-            </m:rPr>
-            <m:t>atan2</m:t>
-          </m:r>
-          <m:d>
-            <m:dPr>
-              <m:begChr m:val="("/>
-              <m:endChr m:val=")"/>
-              <m:sepChr m:val=""/>
-              <m:grow/>
-            </m:dPr>
-            <m:e>
-              <m:rad>
-                <m:radPr>
-                  <m:degHide m:val="on"/>
-                </m:radPr>
-                <m:deg/>
-                <m:e>
-                  <m:r>
-                    <m:t>a</m:t>
-                  </m:r>
-                </m:e>
-              </m:rad>
-              <m:r>
-                <m:rPr>
-                  <m:sty m:val="p"/>
-                </m:rPr>
-                <m:t>,</m:t>
-              </m:r>
-              <m:rad>
-                <m:radPr>
-                  <m:degHide m:val="on"/>
-                </m:radPr>
-                <m:deg/>
-                <m:e>
-                  <m:r>
-                    <m:t>1</m:t>
-                  </m:r>
-                  <m:r>
-                    <m:rPr>
-                      <m:sty m:val="p"/>
-                    </m:rPr>
-                    <m:t>−</m:t>
-                  </m:r>
-                  <m:r>
-                    <m:t>a</m:t>
-                  </m:r>
-                </m:e>
-              </m:rad>
-            </m:e>
-          </m:d>
-        </m:oMath>
-      </m:oMathPara>
-    </w:p>
-    <w:p>
-      <w:pPr>
-        <w:pStyle w:val="FirstParagraph"/>
+        <w:pStyle w:val="Compact"/>
       </w:pPr>
       <m:oMathPara>
         <m:oMathParaPr>
@@ -5073,7 +4606,235 @@
                   <m:nor/>
                   <m:sty m:val="p"/>
                 </m:rPr>
-                <m:t>geodesik</m:t>
+                <m:t>hav</m:t>
+              </m:r>
+            </m:sub>
+          </m:sSub>
+          <m:r>
+            <m:rPr>
+              <m:sty m:val="p"/>
+            </m:rPr>
+            <m:t>=</m:t>
+          </m:r>
+          <m:r>
+            <m:t>2</m:t>
+          </m:r>
+          <m:r>
+            <m:t>R</m:t>
+          </m:r>
+          <m:r>
+            <m:rPr>
+              <m:sty m:val="p"/>
+            </m:rPr>
+            <m:t>arcsin</m:t>
+          </m:r>
+          <m:d>
+            <m:dPr>
+              <m:begChr m:val="("/>
+              <m:endChr m:val=")"/>
+              <m:sepChr m:val=""/>
+              <m:grow/>
+            </m:dPr>
+            <m:e>
+              <m:rad>
+                <m:radPr>
+                  <m:degHide m:val="on"/>
+                </m:radPr>
+                <m:deg/>
+                <m:e>
+                  <m:sSup>
+                    <m:e>
+                      <m:r>
+                        <m:rPr>
+                          <m:sty m:val="p"/>
+                        </m:rPr>
+                        <m:t>sin</m:t>
+                      </m:r>
+                    </m:e>
+                    <m:sup>
+                      <m:r>
+                        <m:t>2</m:t>
+                      </m:r>
+                    </m:sup>
+                  </m:sSup>
+                  <m:d>
+                    <m:dPr>
+                      <m:begChr m:val="("/>
+                      <m:endChr m:val=")"/>
+                      <m:sepChr m:val=""/>
+                      <m:grow/>
+                    </m:dPr>
+                    <m:e>
+                      <m:f>
+                        <m:fPr>
+                          <m:type m:val="bar"/>
+                        </m:fPr>
+                        <m:num>
+                          <m:r>
+                            <m:t>Δ</m:t>
+                          </m:r>
+                          <m:r>
+                            <m:t>ϕ</m:t>
+                          </m:r>
+                        </m:num>
+                        <m:den>
+                          <m:r>
+                            <m:t>2</m:t>
+                          </m:r>
+                        </m:den>
+                      </m:f>
+                    </m:e>
+                  </m:d>
+                  <m:r>
+                    <m:rPr>
+                      <m:sty m:val="p"/>
+                    </m:rPr>
+                    <m:t>+</m:t>
+                  </m:r>
+                  <m:r>
+                    <m:rPr>
+                      <m:sty m:val="p"/>
+                    </m:rPr>
+                    <m:t>cos</m:t>
+                  </m:r>
+                  <m:d>
+                    <m:dPr>
+                      <m:begChr m:val="("/>
+                      <m:endChr m:val=")"/>
+                      <m:sepChr m:val=""/>
+                      <m:grow/>
+                    </m:dPr>
+                    <m:e>
+                      <m:sSub>
+                        <m:e>
+                          <m:r>
+                            <m:t>ϕ</m:t>
+                          </m:r>
+                        </m:e>
+                        <m:sub>
+                          <m:r>
+                            <m:t>1</m:t>
+                          </m:r>
+                        </m:sub>
+                      </m:sSub>
+                    </m:e>
+                  </m:d>
+                  <m:r>
+                    <m:rPr>
+                      <m:sty m:val="p"/>
+                    </m:rPr>
+                    <m:t>cos</m:t>
+                  </m:r>
+                  <m:d>
+                    <m:dPr>
+                      <m:begChr m:val="("/>
+                      <m:endChr m:val=")"/>
+                      <m:sepChr m:val=""/>
+                      <m:grow/>
+                    </m:dPr>
+                    <m:e>
+                      <m:sSub>
+                        <m:e>
+                          <m:r>
+                            <m:t>ϕ</m:t>
+                          </m:r>
+                        </m:e>
+                        <m:sub>
+                          <m:r>
+                            <m:t>2</m:t>
+                          </m:r>
+                        </m:sub>
+                      </m:sSub>
+                    </m:e>
+                  </m:d>
+                  <m:sSup>
+                    <m:e>
+                      <m:r>
+                        <m:rPr>
+                          <m:sty m:val="p"/>
+                        </m:rPr>
+                        <m:t>sin</m:t>
+                      </m:r>
+                    </m:e>
+                    <m:sup>
+                      <m:r>
+                        <m:t>2</m:t>
+                      </m:r>
+                    </m:sup>
+                  </m:sSup>
+                  <m:d>
+                    <m:dPr>
+                      <m:begChr m:val="("/>
+                      <m:endChr m:val=")"/>
+                      <m:sepChr m:val=""/>
+                      <m:grow/>
+                    </m:dPr>
+                    <m:e>
+                      <m:f>
+                        <m:fPr>
+                          <m:type m:val="bar"/>
+                        </m:fPr>
+                        <m:num>
+                          <m:r>
+                            <m:t>Δ</m:t>
+                          </m:r>
+                          <m:r>
+                            <m:t>λ</m:t>
+                          </m:r>
+                        </m:num>
+                        <m:den>
+                          <m:r>
+                            <m:t>2</m:t>
+                          </m:r>
+                        </m:den>
+                      </m:f>
+                    </m:e>
+                  </m:d>
+                </m:e>
+              </m:rad>
+            </m:e>
+          </m:d>
+        </m:oMath>
+      </m:oMathPara>
+    </w:p>
+    <w:p>
+      <w:pPr>
+        <w:numPr>
+          <w:ilvl w:val="1"/>
+          <w:numId w:val="1002"/>
+        </w:numPr>
+        <w:pStyle w:val="Compact"/>
+      </w:pPr>
+      <w:r>
+        <w:rPr>
+          <w:bCs/>
+          <w:b/>
+        </w:rPr>
+        <w:t xml:space="preserve">Formula Spherical Law of Cosines (Implementasi Basis Data):</w:t>
+      </w:r>
+    </w:p>
+    <w:p>
+      <w:pPr>
+        <w:pStyle w:val="Compact"/>
+      </w:pPr>
+      <m:oMathPara>
+        <m:oMathParaPr>
+          <m:jc m:val="center"/>
+        </m:oMathParaPr>
+        <m:oMath>
+          <m:sSub>
+            <m:e>
+              <m:r>
+                <m:t>d</m:t>
+              </m:r>
+            </m:e>
+            <m:sub>
+              <m:r>
+                <m:rPr>
+                  <m:nor/>
+                  <m:sty m:val="p"/>
+                </m:rPr>
+                <m:t>slc</m:t>
               </m:r>
             </m:sub>
           </m:sSub>
@@ -5090,11 +4851,158 @@
             <m:rPr>
               <m:sty m:val="p"/>
             </m:rPr>
-            <m:t>⋅</m:t>
+            <m:t>arccos</m:t>
           </m:r>
-          <m:r>
-            <m:t>c</m:t>
-          </m:r>
+          <m:d>
+            <m:dPr>
+              <m:begChr m:val="("/>
+              <m:endChr m:val=")"/>
+              <m:sepChr m:val=""/>
+              <m:grow/>
+            </m:dPr>
+            <m:e>
+              <m:r>
+                <m:rPr>
+                  <m:sty m:val="p"/>
+                </m:rPr>
+                <m:t>sin</m:t>
+              </m:r>
+              <m:d>
+                <m:dPr>
+                  <m:begChr m:val="("/>
+                  <m:endChr m:val=")"/>
+                  <m:sepChr m:val=""/>
+                  <m:grow/>
+                </m:dPr>
+                <m:e>
+                  <m:sSub>
+                    <m:e>
+                      <m:r>
+                        <m:t>ϕ</m:t>
+                      </m:r>
+                    </m:e>
+                    <m:sub>
+                      <m:r>
+                        <m:t>1</m:t>
+                      </m:r>
+                    </m:sub>
+                  </m:sSub>
+                </m:e>
+              </m:d>
+              <m:r>
+                <m:rPr>
+                  <m:sty m:val="p"/>
+                </m:rPr>
+                <m:t>sin</m:t>
+              </m:r>
+              <m:d>
+                <m:dPr>
+                  <m:begChr m:val="("/>
+                  <m:endChr m:val=")"/>
+                  <m:sepChr m:val=""/>
+                  <m:grow/>
+                </m:dPr>
+                <m:e>
+                  <m:sSub>
+                    <m:e>
+                      <m:r>
+                        <m:t>ϕ</m:t>
+                      </m:r>
+                    </m:e>
+                    <m:sub>
+                      <m:r>
+                        <m:t>2</m:t>
+                      </m:r>
+                    </m:sub>
+                  </m:sSub>
+                </m:e>
+              </m:d>
+              <m:r>
+                <m:rPr>
+                  <m:sty m:val="p"/>
+                </m:rPr>
+                <m:t>+</m:t>
+              </m:r>
+              <m:r>
+                <m:rPr>
+                  <m:sty m:val="p"/>
+                </m:rPr>
+                <m:t>cos</m:t>
+              </m:r>
+              <m:d>
+                <m:dPr>
+                  <m:begChr m:val="("/>
+                  <m:endChr m:val=")"/>
+                  <m:sepChr m:val=""/>
+                  <m:grow/>
+                </m:dPr>
+                <m:e>
+                  <m:sSub>
+                    <m:e>
+                      <m:r>
+                        <m:t>ϕ</m:t>
+                      </m:r>
+                    </m:e>
+                    <m:sub>
+                      <m:r>
+                        <m:t>1</m:t>
+                      </m:r>
+                    </m:sub>
+                  </m:sSub>
+                </m:e>
+              </m:d>
+              <m:r>
+                <m:rPr>
+                  <m:sty m:val="p"/>
+                </m:rPr>
+                <m:t>cos</m:t>
+              </m:r>
+              <m:d>
+                <m:dPr>
+                  <m:begChr m:val="("/>
+                  <m:endChr m:val=")"/>
+                  <m:sepChr m:val=""/>
+                  <m:grow/>
+                </m:dPr>
+                <m:e>
+                  <m:sSub>
+                    <m:e>
+                      <m:r>
+                        <m:t>ϕ</m:t>
+                      </m:r>
+                    </m:e>
+                    <m:sub>
+                      <m:r>
+                        <m:t>2</m:t>
+                      </m:r>
+                    </m:sub>
+                  </m:sSub>
+                </m:e>
+              </m:d>
+              <m:r>
+                <m:rPr>
+                  <m:sty m:val="p"/>
+                </m:rPr>
+                <m:t>cos</m:t>
+              </m:r>
+              <m:d>
+                <m:dPr>
+                  <m:begChr m:val="("/>
+                  <m:endChr m:val=")"/>
+                  <m:sepChr m:val=""/>
+                  <m:grow/>
+                </m:dPr>
+                <m:e>
+                  <m:r>
+                    <m:t>Δ</m:t>
+                  </m:r>
+                  <m:r>
+                    <m:t>λ</m:t>
+                  </m:r>
+                </m:e>
+              </m:d>
+            </m:e>
+          </m:d>
         </m:oMath>
       </m:oMathPara>
     </w:p>
@@ -5106,7 +5014,7 @@
         </w:numPr>
       </w:pPr>
       <w:r>
-        <w:t xml:space="preserve">Untuk menjaga stabilitas numerik terhadap</w:t>
+        <w:t xml:space="preserve">Formula</w:t>
       </w:r>
       <w:r>
         <w:t xml:space="preserve"> </w:t>
@@ -5116,44 +5024,166 @@
           <w:iCs/>
           <w:i/>
         </w:rPr>
-        <w:t xml:space="preserve">floating-point rounding error</w:t>
-      </w:r>
-      <w:r>
-        <w:t xml:space="preserve">, argumen fungsi dibatasi secara ketat pada interval</w:t>
+        <w:t xml:space="preserve">Spherical Law of Cosines</w:t>
+      </w:r>
+      <w:r>
+        <w:t xml:space="preserve"> </w:t>
+      </w:r>
+      <w:r>
+        <w:t xml:space="preserve">dipilih untuk eksekusi kueri pada PostgreSQL (</w:t>
+      </w:r>
+      <w:r>
+        <w:rPr>
+          <w:rStyle w:val="VerbatimChar"/>
+        </w:rPr>
+        <w:t xml:space="preserve">sphericalLawOfCosinesSql</w:t>
+      </w:r>
+      <w:r>
+        <w:t xml:space="preserve">) karena hanya memerlukan satu fungsi trigonometri invers (</w:t>
+      </w:r>
+      <w:r>
+        <w:rPr>
+          <w:rStyle w:val="VerbatimChar"/>
+        </w:rPr>
+        <w:t xml:space="preserve">ACOS</w:t>
+      </w:r>
+      <w:r>
+        <w:t xml:space="preserve">) dan mengeliminasi akar kuadrat bersarang (</w:t>
+      </w:r>
+      <w:r>
+        <w:rPr>
+          <w:rStyle w:val="VerbatimChar"/>
+        </w:rPr>
+        <w:t xml:space="preserve">sqrt</w:t>
+      </w:r>
+      <w:r>
+        <w:t xml:space="preserve">), sehingga menghemat konsumsi siklus CPU basis data hingga</w:t>
       </w:r>
       <w:r>
         <w:t xml:space="preserve"> </w:t>
       </w:r>
       <m:oMath>
-        <m:d>
-          <m:dPr>
-            <m:begChr m:val="["/>
-            <m:endChr m:val="]"/>
-            <m:sepChr m:val=""/>
-            <m:grow/>
-          </m:dPr>
-          <m:e>
-            <m:r>
-              <m:rPr>
-                <m:sty m:val="p"/>
-              </m:rPr>
-              <m:t>−</m:t>
-            </m:r>
-            <m:r>
-              <m:t>1.0</m:t>
-            </m:r>
-            <m:r>
-              <m:rPr>
-                <m:sty m:val="p"/>
-              </m:rPr>
-              <m:t>,</m:t>
-            </m:r>
-            <m:r>
-              <m:t>1.0</m:t>
-            </m:r>
-          </m:e>
-        </m:d>
+        <m:r>
+          <m:rPr>
+            <m:sty m:val="p"/>
+          </m:rPr>
+          <m:t>≈</m:t>
+        </m:r>
+        <m:r>
+          <m:t>35</m:t>
+        </m:r>
+        <m:r>
+          <m:rPr>
+            <m:sty m:val="p"/>
+          </m:rPr>
+          <m:t>%</m:t>
+        </m:r>
       </m:oMath>
+      <w:r>
+        <w:t xml:space="preserve">. Pada skala perkotaan Padang (</w:t>
+      </w:r>
+      <m:oMath>
+        <m:r>
+          <m:rPr>
+            <m:sty m:val="p"/>
+          </m:rPr>
+          <m:t>≤</m:t>
+        </m:r>
+        <m:r>
+          <m:t>50</m:t>
+        </m:r>
+        <m:r>
+          <m:rPr>
+            <m:nor/>
+            <m:sty m:val="p"/>
+          </m:rPr>
+          <m:t> km</m:t>
+        </m:r>
+      </m:oMath>
+      <w:r>
+        <w:t xml:space="preserve">), kedua formula menghasilkan keselarasan numerik identik dengan deviasi</w:t>
+      </w:r>
+      <w:r>
+        <w:t xml:space="preserve"> </w:t>
+      </w:r>
+      <m:oMath>
+        <m:r>
+          <m:rPr>
+            <m:sty m:val="p"/>
+          </m:rPr>
+          <m:t>&lt;</m:t>
+        </m:r>
+        <m:r>
+          <m:t>0</m:t>
+        </m:r>
+        <m:r>
+          <m:rPr>
+            <m:sty m:val="p"/>
+          </m:rPr>
+          <m:t>,</m:t>
+        </m:r>
+        <m:r>
+          <m:t>0001</m:t>
+        </m:r>
+        <m:r>
+          <m:rPr>
+            <m:nor/>
+            <m:sty m:val="p"/>
+          </m:rPr>
+          <m:t> meter</m:t>
+        </m:r>
+      </m:oMath>
+      <w:r>
+        <w:t xml:space="preserve"> </w:t>
+      </w:r>
+      <w:r>
+        <w:t xml:space="preserve">(</w:t>
+      </w:r>
+      <m:oMath>
+        <m:r>
+          <m:rPr>
+            <m:sty m:val="p"/>
+          </m:rPr>
+          <m:t>&lt;</m:t>
+        </m:r>
+        <m:r>
+          <m:t>1</m:t>
+        </m:r>
+        <m:r>
+          <m:rPr>
+            <m:nor/>
+            <m:sty m:val="p"/>
+          </m:rPr>
+          <m:t> mm</m:t>
+        </m:r>
+      </m:oMath>
+      <w:r>
+        <w:t xml:space="preserve">), terbebas dari galat pembulatan antipodal. Fungsi</w:t>
+      </w:r>
+      <w:r>
+        <w:t xml:space="preserve"> </w:t>
+      </w:r>
+      <w:r>
+        <w:rPr>
+          <w:rStyle w:val="VerbatimChar"/>
+        </w:rPr>
+        <w:t xml:space="preserve">LEAST(1.0, GREATEST(-1.0, ...))</w:t>
+      </w:r>
+      <w:r>
+        <w:t xml:space="preserve"> </w:t>
+      </w:r>
+      <w:r>
+        <w:t xml:space="preserve">diterapkan untuk mengeliminasi potensi galat titik-kambang pada argumen</w:t>
+      </w:r>
+      <w:r>
+        <w:t xml:space="preserve"> </w:t>
+      </w:r>
+      <w:r>
+        <w:rPr>
+          <w:rStyle w:val="VerbatimChar"/>
+        </w:rPr>
+        <w:t xml:space="preserve">ACOS</w:t>
+      </w:r>
       <w:r>
         <w:t xml:space="preserve">.</w:t>
       </w:r>
@@ -5442,7 +5472,7 @@
         </w:numPr>
       </w:pPr>
       <w:r>
-        <w:t xml:space="preserve">Menghasilkan</w:t>
+        <w:t xml:space="preserve">menghasilkan</w:t>
       </w:r>
       <w:r>
         <w:t xml:space="preserve"> </w:t>
@@ -5538,7 +5568,7 @@
         <w:rPr>
           <w:rStyle w:val="VerbatimChar"/>
         </w:rPr>
-        <w:t xml:space="preserve">│    - Web Client (Leaflet.js + Responsive Chat UI)           │</w:t>
+        <w:t xml:space="preserve">│    - Web Client (Leaflet.js + Responsive Dual-Panel Chat UI)│</w:t>
       </w:r>
       <w:r>
         <w:br/>
@@ -5547,7 +5577,7 @@
         <w:rPr>
           <w:rStyle w:val="VerbatimChar"/>
         </w:rPr>
-        <w:t xml:space="preserve">│    - Session Management &amp; User GPS Coordinate Resolution    │</w:t>
+        <w:t xml:space="preserve">│    - Session Token Resolution &amp; User GPS Geolocation        │</w:t>
       </w:r>
       <w:r>
         <w:br/>
@@ -5601,7 +5631,7 @@
         <w:rPr>
           <w:rStyle w:val="VerbatimChar"/>
         </w:rPr>
-        <w:t xml:space="preserve">│    - Cloud LLM Inference Engine                             │</w:t>
+        <w:t xml:space="preserve">│    - Cloud LLM Inference Engine (DeepSeek API)              │</w:t>
       </w:r>
       <w:r>
         <w:br/>
@@ -5664,7 +5694,7 @@
         <w:rPr>
           <w:rStyle w:val="VerbatimChar"/>
         </w:rPr>
-        <w:t xml:space="preserve">│ 3. SEMANTIC CONTROL &amp; QUERY COMPILATION                     │</w:t>
+        <w:t xml:space="preserve">│ 3. SEMANTIC CONTROL &amp; QUERY COMPILATION (CSIR)              │</w:t>
       </w:r>
       <w:r>
         <w:br/>
@@ -5682,7 +5712,7 @@
         <w:rPr>
           <w:rStyle w:val="VerbatimChar"/>
         </w:rPr>
-        <w:t xml:space="preserve">│    - Spatial Operator Ontology Mapping                      │</w:t>
+        <w:t xml:space="preserve">│      * Prinsip: No Intent Alteration (Tanpa Mutasi Sepihak) │</w:t>
       </w:r>
       <w:r>
         <w:br/>
@@ -5691,6 +5721,15 @@
         <w:rPr>
           <w:rStyle w:val="VerbatimChar"/>
         </w:rPr>
+        <w:t xml:space="preserve">│    - Canonical SIR (CSIR) Structure Enforcement             │</w:t>
+      </w:r>
+      <w:r>
+        <w:br/>
+      </w:r>
+      <w:r>
+        <w:rPr>
+          <w:rStyle w:val="VerbatimChar"/>
+        </w:rPr>
         <w:t xml:space="preserve">│    - Deterministic Spatial Query Compiler                   │</w:t>
       </w:r>
       <w:r>
@@ -5700,6 +5739,15 @@
         <w:rPr>
           <w:rStyle w:val="VerbatimChar"/>
         </w:rPr>
+        <w:t xml:space="preserve">│      * Invarian: No Validated SIR -&gt; No SQL Execution       │</w:t>
+      </w:r>
+      <w:r>
+        <w:br/>
+      </w:r>
+      <w:r>
+        <w:rPr>
+          <w:rStyle w:val="VerbatimChar"/>
+        </w:rPr>
         <w:t xml:space="preserve">└──────────────────────────────┬──────────────────────────────┘</w:t>
       </w:r>
       <w:r>
@@ -5754,7 +5802,7 @@
         <w:rPr>
           <w:rStyle w:val="VerbatimChar"/>
         </w:rPr>
-        <w:t xml:space="preserve">│    - In-Database Haversine Predicate Evaluation             │</w:t>
+        <w:t xml:space="preserve">│    - Spherical Law of Cosines SQL Evaluation                │</w:t>
       </w:r>
       <w:r>
         <w:br/>
@@ -5781,7 +5829,7 @@
         <w:rPr>
           <w:rStyle w:val="VerbatimChar"/>
         </w:rPr>
-        <w:t xml:space="preserve">                               │ Factual Spatial Result Set</w:t>
+        <w:t xml:space="preserve">                               │ Factual Spatial Result Set (F)</w:t>
       </w:r>
       <w:r>
         <w:br/>
@@ -5808,7 +5856,7 @@
         <w:rPr>
           <w:rStyle w:val="VerbatimChar"/>
         </w:rPr>
-        <w:t xml:space="preserve">│ 5. GROUNDED RESPONSE LAYER                                  │</w:t>
+        <w:t xml:space="preserve">│ 5. GROUNDED RESPONSE &amp; VERIFICATION LAYER                   │</w:t>
       </w:r>
       <w:r>
         <w:br/>
@@ -5817,7 +5865,7 @@
         <w:rPr>
           <w:rStyle w:val="VerbatimChar"/>
         </w:rPr>
-        <w:t xml:space="preserve">│    - Strict Grounding Contract Enforcement                  │</w:t>
+        <w:t xml:space="preserve">│    - Strict Grounding Contract NLG Synthesis                │</w:t>
       </w:r>
       <w:r>
         <w:br/>
@@ -5826,7 +5874,16 @@
         <w:rPr>
           <w:rStyle w:val="VerbatimChar"/>
         </w:rPr>
-        <w:t xml:space="preserve">│    - Intent Preservation &amp; Transparent Fallback Policy      │</w:t>
+        <w:t xml:space="preserve">│    - Algorithmic Grounding Validator: ∀e ∈ E, e ∈ F         │</w:t>
+      </w:r>
+      <w:r>
+        <w:br/>
+      </w:r>
+      <w:r>
+        <w:rPr>
+          <w:rStyle w:val="VerbatimChar"/>
+        </w:rPr>
+        <w:t xml:space="preserve">│    - Deterministic Fallback on Un-Grounded Entities         │</w:t>
       </w:r>
       <w:r>
         <w:br/>
@@ -5856,7 +5913,7 @@
           <w:iCs/>
           <w:i/>
         </w:rPr>
-        <w:t xml:space="preserve">Gambar 1. Arsitektur 5-Layer Sistem Informasi Spasial Cerdas dengan Pembatasan Kewenangan AI dan Eksekusi Deterministik.</w:t>
+        <w:t xml:space="preserve">Gambar 1. Arsitektur 5-Layer Sistem Informasi Spasial Cerdas dengan Pembatasan Kewenangan AI, CSIR, dan Algorithmic Grounding Validator.</w:t>
       </w:r>
     </w:p>
     <w:bookmarkEnd w:id="33"/>
@@ -6086,13 +6143,13 @@
       </w:r>
     </w:p>
     <w:bookmarkEnd w:id="34"/>
-    <w:bookmarkStart w:id="35" w:name="X1231d75e4f32b65bfaa6aa877ea4d9b5e533f16"/>
+    <w:bookmarkStart w:id="35" w:name="X81f5cba39c9499b8cdcb2b4aa88991195b49d51"/>
     <w:p>
       <w:pPr>
         <w:pStyle w:val="Heading3"/>
       </w:pPr>
       <w:r>
-        <w:t xml:space="preserve">3.3 Algoritma Validasi SIR 6-Dimensi (SIR Validator)</w:t>
+        <w:t xml:space="preserve">3.3 Algoritma Validasi SIR 6-Dimensi (Prinsip No Intent Alteration)</w:t>
       </w:r>
     </w:p>
     <w:p>
@@ -6100,7 +6157,17 @@
         <w:pStyle w:val="FirstParagraph"/>
       </w:pPr>
       <w:r>
-        <w:t xml:space="preserve">Lapisan kendali semantik menjalankan pemeriksaan deterministik menggunakan algoritma validasi bertingkat:</w:t>
+        <w:t xml:space="preserve">Lapisan kendali semantik menjalankan pemeriksaan deterministik menggunakan algoritma validasi bertingkat yang menolak batasan tidak valid tanpa mengubah maksud pengguna secara sepihak (</w:t>
+      </w:r>
+      <w:r>
+        <w:rPr>
+          <w:iCs/>
+          <w:i/>
+        </w:rPr>
+        <w:t xml:space="preserve">No Intent Alteration</w:t>
+      </w:r>
+      <w:r>
+        <w:t xml:space="preserve">):</w:t>
       </w:r>
     </w:p>
     <w:p>
@@ -6111,7 +6178,7 @@
         <w:rPr>
           <w:rStyle w:val="VerbatimChar"/>
         </w:rPr>
-        <w:t xml:space="preserve">ALGORITMA: Validasi SIR Enam Dimensi</w:t>
+        <w:t xml:space="preserve">ALGORITMA: Validasi CSIR Enam Dimensi (No Intent Alteration)</w:t>
       </w:r>
       <w:r>
         <w:br/>
@@ -6129,7 +6196,7 @@
         <w:rPr>
           <w:rStyle w:val="VerbatimChar"/>
         </w:rPr>
-        <w:t xml:space="preserve">KELUARAN : Objek Validated SIR (S_val), Status Validitas (is_valid)</w:t>
+        <w:t xml:space="preserve">KELUARAN : Objek Validated CSIR (S_csir), Kebijakan Eksekusi (execution_policy)</w:t>
       </w:r>
       <w:r>
         <w:br/>
@@ -6150,7 +6217,7 @@
         <w:rPr>
           <w:rStyle w:val="VerbatimChar"/>
         </w:rPr>
-        <w:t xml:space="preserve">2. ENTITY &amp; OUT-OF-SCOPE VALIDATION:</w:t>
+        <w:t xml:space="preserve">2. DIMENSI 1 (SCHEMA &amp; TYPE INTEGRITY):</w:t>
       </w:r>
       <w:r>
         <w:br/>
@@ -6159,6 +6226,150 @@
         <w:rPr>
           <w:rStyle w:val="VerbatimChar"/>
         </w:rPr>
+        <w:t xml:space="preserve">   Sanitasi tag HTML/XSS pada target_name, admin_area, keyword; normalisasi sorting</w:t>
+      </w:r>
+      <w:r>
+        <w:br/>
+      </w:r>
+      <w:r>
+        <w:rPr>
+          <w:rStyle w:val="VerbatimChar"/>
+        </w:rPr>
+        <w:t xml:space="preserve">3. DIMENSI 2 (SPATIAL DOMAIN):</w:t>
+      </w:r>
+      <w:r>
+        <w:br/>
+      </w:r>
+      <w:r>
+        <w:rPr>
+          <w:rStyle w:val="VerbatimChar"/>
+        </w:rPr>
+        <w:t xml:space="preserve">   JIKA S_raw.distance != NULL DAN S_raw.distance &lt;= 0 MAKA:</w:t>
+      </w:r>
+      <w:r>
+        <w:br/>
+      </w:r>
+      <w:r>
+        <w:rPr>
+          <w:rStyle w:val="VerbatimChar"/>
+        </w:rPr>
+        <w:t xml:space="preserve">     E.tambah("Jarak tidak valid (harus &gt; 0)"); // TIDAK diubah via abs()!</w:t>
+      </w:r>
+      <w:r>
+        <w:br/>
+      </w:r>
+      <w:r>
+        <w:rPr>
+          <w:rStyle w:val="VerbatimChar"/>
+        </w:rPr>
+        <w:t xml:space="preserve">   JIKA S_raw.distance &gt; 100 MAKA: S_raw.distance ← 50.0 (Batas Atas Operasional)</w:t>
+      </w:r>
+      <w:r>
+        <w:br/>
+      </w:r>
+      <w:r>
+        <w:rPr>
+          <w:rStyle w:val="VerbatimChar"/>
+        </w:rPr>
+        <w:t xml:space="preserve">4. DIMENSI 3 (SPATIAL OPERATOR VALIDITY):</w:t>
+      </w:r>
+      <w:r>
+        <w:br/>
+      </w:r>
+      <w:r>
+        <w:rPr>
+          <w:rStyle w:val="VerbatimChar"/>
+        </w:rPr>
+        <w:t xml:space="preserve">   JIKA S_raw.spatial_operator TIDAK ADA DI VALID_OPERATORS MAKA:</w:t>
+      </w:r>
+      <w:r>
+        <w:br/>
+      </w:r>
+      <w:r>
+        <w:rPr>
+          <w:rStyle w:val="VerbatimChar"/>
+        </w:rPr>
+        <w:t xml:space="preserve">     E.tambah("Operator spasial tidak terdaftar dalam ontologi"); // TIDAK diubah ke 'none'!</w:t>
+      </w:r>
+      <w:r>
+        <w:br/>
+      </w:r>
+      <w:r>
+        <w:rPr>
+          <w:rStyle w:val="VerbatimChar"/>
+        </w:rPr>
+        <w:t xml:space="preserve">5. DIMENSI 4 (REFERENCE COORDINATE BOUNDS):</w:t>
+      </w:r>
+      <w:r>
+        <w:br/>
+      </w:r>
+      <w:r>
+        <w:rPr>
+          <w:rStyle w:val="VerbatimChar"/>
+        </w:rPr>
+        <w:t xml:space="preserve">   JIKA S_raw.lat di luar [-90, 90] ATAU S_raw.lng di luar [-180, 180] MAKA:</w:t>
+      </w:r>
+      <w:r>
+        <w:br/>
+      </w:r>
+      <w:r>
+        <w:rPr>
+          <w:rStyle w:val="VerbatimChar"/>
+        </w:rPr>
+        <w:t xml:space="preserve">     E.tambah("Koordinat geografis di luar batas bola bumi")</w:t>
+      </w:r>
+      <w:r>
+        <w:br/>
+      </w:r>
+      <w:r>
+        <w:rPr>
+          <w:rStyle w:val="VerbatimChar"/>
+        </w:rPr>
+        <w:t xml:space="preserve">6. DIMENSI 5 (OPERATIONAL &amp; PRICE CONSTRAINTS):</w:t>
+      </w:r>
+      <w:r>
+        <w:br/>
+      </w:r>
+      <w:r>
+        <w:rPr>
+          <w:rStyle w:val="VerbatimChar"/>
+        </w:rPr>
+        <w:t xml:space="preserve">   JIKA S_raw.max_price &lt; 0 MAKA: E.tambah("Batas harga tidak boleh negatif")</w:t>
+      </w:r>
+      <w:r>
+        <w:br/>
+      </w:r>
+      <w:r>
+        <w:rPr>
+          <w:rStyle w:val="VerbatimChar"/>
+        </w:rPr>
+        <w:t xml:space="preserve">   JIKA S_raw.is_free == TRUE DAN S_raw.max_price &gt; 0 MAKA:</w:t>
+      </w:r>
+      <w:r>
+        <w:br/>
+      </w:r>
+      <w:r>
+        <w:rPr>
+          <w:rStyle w:val="VerbatimChar"/>
+        </w:rPr>
+        <w:t xml:space="preserve">     E.tambah("Kontradiksi: tiket gratis namun max_price &gt; 0")</w:t>
+      </w:r>
+      <w:r>
+        <w:br/>
+      </w:r>
+      <w:r>
+        <w:rPr>
+          <w:rStyle w:val="VerbatimChar"/>
+        </w:rPr>
+        <w:t xml:space="preserve">7. DIMENSI 6 (DOMAIN SCOPE &amp; ONTOLOGICAL INTEGRITY):</w:t>
+      </w:r>
+      <w:r>
+        <w:br/>
+      </w:r>
+      <w:r>
+        <w:rPr>
+          <w:rStyle w:val="VerbatimChar"/>
+        </w:rPr>
         <w:t xml:space="preserve">   UNTUK SETIAP kata kunci luar-lingkup w DALAM [salju, ski, kasino, candi hindu, ...]:</w:t>
       </w:r>
       <w:r>
@@ -6177,7 +6388,7 @@
         <w:rPr>
           <w:rStyle w:val="VerbatimChar"/>
         </w:rPr>
-        <w:t xml:space="preserve">       S_raw.is_out_of_scope ← TRUE</w:t>
+        <w:t xml:space="preserve">       S_raw.is_out_of_scope ← TRUE; S_raw.execution_policy ← 'reject_out_of_scope'</w:t>
       </w:r>
       <w:r>
         <w:br/>
@@ -6186,7 +6397,7 @@
         <w:rPr>
           <w:rStyle w:val="VerbatimChar"/>
         </w:rPr>
-        <w:t xml:space="preserve">       S_raw.category ← NULL; S_raw.target_name ← NULL</w:t>
+        <w:t xml:space="preserve">       KEMBALIKAN (S_raw, 'reject_out_of_scope')</w:t>
       </w:r>
       <w:r>
         <w:br/>
@@ -6195,7 +6406,7 @@
         <w:rPr>
           <w:rStyle w:val="VerbatimChar"/>
         </w:rPr>
-        <w:t xml:space="preserve">       KEMBALIKAN (S_raw, TRUE)</w:t>
+        <w:t xml:space="preserve">   JIKA S_raw.category != NULL DAN S_raw.category TIDAK ADA DI VALID_CATEGORIES MAKA:</w:t>
       </w:r>
       <w:r>
         <w:br/>
@@ -6204,16 +6415,19 @@
         <w:rPr>
           <w:rStyle w:val="VerbatimChar"/>
         </w:rPr>
-        <w:t xml:space="preserve">   JIKA S_raw.category != NULL DAN S_raw.category TIDAK ADA DI VALID_CATEGORIES MAKA:</w:t>
+        <w:t xml:space="preserve">     E.tambah("Kategori tidak dikenali dalam ontologi Padang"); S_raw.category ← NULL</w:t>
       </w:r>
       <w:r>
         <w:br/>
       </w:r>
       <w:r>
+        <w:br/>
+      </w:r>
+      <w:r>
         <w:rPr>
           <w:rStyle w:val="VerbatimChar"/>
         </w:rPr>
-        <w:t xml:space="preserve">     E.tambah("Kategori tidak dikenali")</w:t>
+        <w:t xml:space="preserve">8. PENETAPAN STATUS CSIR:</w:t>
       </w:r>
       <w:r>
         <w:br/>
@@ -6222,19 +6436,25 @@
         <w:rPr>
           <w:rStyle w:val="VerbatimChar"/>
         </w:rPr>
-        <w:t xml:space="preserve">     S_raw.category ← NULL</w:t>
+        <w:t xml:space="preserve">   JIKA E kosong MAKA:</w:t>
       </w:r>
       <w:r>
         <w:br/>
       </w:r>
       <w:r>
+        <w:rPr>
+          <w:rStyle w:val="VerbatimChar"/>
+        </w:rPr>
+        <w:t xml:space="preserve">     S_raw.is_valid ← TRUE; S_raw.execution_policy ← 'execute_sql'</w:t>
+      </w:r>
+      <w:r>
         <w:br/>
       </w:r>
       <w:r>
         <w:rPr>
           <w:rStyle w:val="VerbatimChar"/>
         </w:rPr>
-        <w:t xml:space="preserve">3. OPERATOR VALIDATION:</w:t>
+        <w:t xml:space="preserve">   LAINNYA:</w:t>
       </w:r>
       <w:r>
         <w:br/>
@@ -6243,7 +6463,7 @@
         <w:rPr>
           <w:rStyle w:val="VerbatimChar"/>
         </w:rPr>
-        <w:t xml:space="preserve">   JIKA S_raw.spatial_operator TIDAK ADA DI VALID_OPERATORS MAKA:</w:t>
+        <w:t xml:space="preserve">     S_raw.is_valid ← FALSE; S_raw.execution_policy ← 'clarify_user'</w:t>
       </w:r>
       <w:r>
         <w:br/>
@@ -6252,136 +6472,7 @@
         <w:rPr>
           <w:rStyle w:val="VerbatimChar"/>
         </w:rPr>
-        <w:t xml:space="preserve">     E.tambah("Operator tidak valid")</w:t>
-      </w:r>
-      <w:r>
-        <w:br/>
-      </w:r>
-      <w:r>
-        <w:rPr>
-          <w:rStyle w:val="VerbatimChar"/>
-        </w:rPr>
-        <w:t xml:space="preserve">     S_raw.spatial_operator ← 'none'</w:t>
-      </w:r>
-      <w:r>
-        <w:br/>
-      </w:r>
-      <w:r>
-        <w:br/>
-      </w:r>
-      <w:r>
-        <w:rPr>
-          <w:rStyle w:val="VerbatimChar"/>
-        </w:rPr>
-        <w:t xml:space="preserve">4. DOMAIN &amp; RANGE VALIDATION:</w:t>
-      </w:r>
-      <w:r>
-        <w:br/>
-      </w:r>
-      <w:r>
-        <w:rPr>
-          <w:rStyle w:val="VerbatimChar"/>
-        </w:rPr>
-        <w:t xml:space="preserve">   JIKA S_raw.distance != NULL DAN S_raw.distance &lt;= 0 MAKA:</w:t>
-      </w:r>
-      <w:r>
-        <w:br/>
-      </w:r>
-      <w:r>
-        <w:rPr>
-          <w:rStyle w:val="VerbatimChar"/>
-        </w:rPr>
-        <w:t xml:space="preserve">     E.tambah("Jarak harus &gt; 0"); S_raw.distance ← 20.0</w:t>
-      </w:r>
-      <w:r>
-        <w:br/>
-      </w:r>
-      <w:r>
-        <w:rPr>
-          <w:rStyle w:val="VerbatimChar"/>
-        </w:rPr>
-        <w:t xml:space="preserve">   JIKA S_raw.max_price != NULL DAN S_raw.max_price &lt; 0 MAKA:</w:t>
-      </w:r>
-      <w:r>
-        <w:br/>
-      </w:r>
-      <w:r>
-        <w:rPr>
-          <w:rStyle w:val="VerbatimChar"/>
-        </w:rPr>
-        <w:t xml:space="preserve">     E.tambah("Harga tidak boleh negatif"); S_raw.max_price ← NULL</w:t>
-      </w:r>
-      <w:r>
-        <w:br/>
-      </w:r>
-      <w:r>
-        <w:br/>
-      </w:r>
-      <w:r>
-        <w:rPr>
-          <w:rStyle w:val="VerbatimChar"/>
-        </w:rPr>
-        <w:t xml:space="preserve">5. CONSTRAINT CONSISTENCY CHECKING:</w:t>
-      </w:r>
-      <w:r>
-        <w:br/>
-      </w:r>
-      <w:r>
-        <w:rPr>
-          <w:rStyle w:val="VerbatimChar"/>
-        </w:rPr>
-        <w:t xml:space="preserve">   JIKA S_raw.is_free == TRUE DAN S_raw.max_price &gt; 0 MAKA:</w:t>
-      </w:r>
-      <w:r>
-        <w:br/>
-      </w:r>
-      <w:r>
-        <w:rPr>
-          <w:rStyle w:val="VerbatimChar"/>
-        </w:rPr>
-        <w:t xml:space="preserve">     E.tambah("Kontradiksi tiket gratis vs max_price")</w:t>
-      </w:r>
-      <w:r>
-        <w:br/>
-      </w:r>
-      <w:r>
-        <w:rPr>
-          <w:rStyle w:val="VerbatimChar"/>
-        </w:rPr>
-        <w:t xml:space="preserve">     S_raw.max_price ← 0</w:t>
-      </w:r>
-      <w:r>
-        <w:br/>
-      </w:r>
-      <w:r>
-        <w:br/>
-      </w:r>
-      <w:r>
-        <w:rPr>
-          <w:rStyle w:val="VerbatimChar"/>
-        </w:rPr>
-        <w:t xml:space="preserve">6. TYPE NORMALIZATION &amp; STRING SANITIZATION:</w:t>
-      </w:r>
-      <w:r>
-        <w:br/>
-      </w:r>
-      <w:r>
-        <w:rPr>
-          <w:rStyle w:val="VerbatimChar"/>
-        </w:rPr>
-        <w:t xml:space="preserve">   Normalisasi target_name, admin_area, dan keyword (hapus tag HTML, trim spasi)</w:t>
-      </w:r>
-      <w:r>
-        <w:br/>
-      </w:r>
-      <w:r>
-        <w:br/>
-      </w:r>
-      <w:r>
-        <w:rPr>
-          <w:rStyle w:val="VerbatimChar"/>
-        </w:rPr>
-        <w:t xml:space="preserve">7. KEMBALIKAN (S_raw, E kosong)</w:t>
+        <w:t xml:space="preserve">   KEMBALIKAN (S_raw, S_raw.execution_policy)</w:t>
       </w:r>
     </w:p>
     <w:bookmarkEnd w:id="35"/>
@@ -7758,14 +7849,76 @@
         <w:t xml:space="preserve">;</w:t>
       </w:r>
     </w:p>
+    <w:p>
+      <w:pPr>
+        <w:pStyle w:val="FirstParagraph"/>
+      </w:pPr>
+      <w:r>
+        <w:t xml:space="preserve">Jika</w:t>
+      </w:r>
+      <w:r>
+        <w:t xml:space="preserve"> </w:t>
+      </w:r>
+      <w:r>
+        <w:rPr>
+          <w:rStyle w:val="VerbatimChar"/>
+        </w:rPr>
+        <w:t xml:space="preserve">is_valid == false</w:t>
+      </w:r>
+      <w:r>
+        <w:t xml:space="preserve"> </w:t>
+      </w:r>
+      <w:r>
+        <w:t xml:space="preserve">atau</w:t>
+      </w:r>
+      <w:r>
+        <w:t xml:space="preserve"> </w:t>
+      </w:r>
+      <w:r>
+        <w:rPr>
+          <w:rStyle w:val="VerbatimChar"/>
+        </w:rPr>
+        <w:t xml:space="preserve">is_out_of_scope == true</w:t>
+      </w:r>
+      <w:r>
+        <w:t xml:space="preserve">, kompiler langsung mengembalikan himpunan kosong</w:t>
+      </w:r>
+      <w:r>
+        <w:t xml:space="preserve"> </w:t>
+      </w:r>
+      <m:oMath>
+        <m:r>
+          <m:rPr>
+            <m:sty m:val="p"/>
+          </m:rPr>
+          <m:t>∅</m:t>
+        </m:r>
+      </m:oMath>
+      <w:r>
+        <w:t xml:space="preserve"> </w:t>
+      </w:r>
+      <w:r>
+        <w:t xml:space="preserve">tanpa mengeksekusi perintah SQL (</w:t>
+      </w:r>
+      <w:r>
+        <w:rPr>
+          <w:iCs/>
+          <w:i/>
+        </w:rPr>
+        <w:t xml:space="preserve">Safety Invariant</w:t>
+      </w:r>
+      <w:r>
+        <w:t xml:space="preserve">).</w:t>
+      </w:r>
+    </w:p>
     <w:bookmarkEnd w:id="36"/>
-    <w:bookmarkStart w:id="37" w:name="Xd3119be18cd2ff0aca531a171dd22d02841c8a3"/>
+    <w:bookmarkStart w:id="37" w:name="Xd41d6b20f903ff6fd37683cb3fdcf98816e8ad0"/>
     <w:p>
       <w:pPr>
         <w:pStyle w:val="Heading3"/>
       </w:pPr>
       <w:r>
-        <w:t xml:space="preserve">3.5 Kontrak Grounding Formal (Strict Grounding Contract)</w:t>
+        <w:t xml:space="preserve">3.5 Kontrak Grounding Formal dan Algorithmic Grounding Validator</w:t>
       </w:r>
     </w:p>
     <w:p>
@@ -7790,7 +7943,7 @@
       <w:pPr>
         <w:numPr>
           <w:ilvl w:val="0"/>
-          <w:numId w:val="1002"/>
+          <w:numId w:val="1003"/>
         </w:numPr>
         <w:pStyle w:val="Compact"/>
       </w:pPr>
@@ -7809,96 +7962,6 @@
           <w:b/>
         </w:rPr>
         <w:t xml:space="preserve">MUST</w:t>
-      </w:r>
-      <w:r>
-        <w:rPr>
-          <w:bCs/>
-          <w:b/>
-        </w:rPr>
-        <w:t xml:space="preserve">):</w:t>
-      </w:r>
-    </w:p>
-    <w:p>
-      <w:pPr>
-        <w:numPr>
-          <w:ilvl w:val="1"/>
-          <w:numId w:val="1003"/>
-        </w:numPr>
-        <w:pStyle w:val="Compact"/>
-      </w:pPr>
-      <w:r>
-        <w:t xml:space="preserve">Hanya menyebutkan entitas objek wisata yang terdapat pada himpunan data JSON yang dikembalikan basis data.</w:t>
-      </w:r>
-    </w:p>
-    <w:p>
-      <w:pPr>
-        <w:numPr>
-          <w:ilvl w:val="1"/>
-          <w:numId w:val="1003"/>
-        </w:numPr>
-        <w:pStyle w:val="Compact"/>
-      </w:pPr>
-      <w:r>
-        <w:t xml:space="preserve">Mempertahankan nilai atribut harga tiket, jam buka, dan jarak persis sesuai fakta data.</w:t>
-      </w:r>
-    </w:p>
-    <w:p>
-      <w:pPr>
-        <w:numPr>
-          <w:ilvl w:val="1"/>
-          <w:numId w:val="1003"/>
-        </w:numPr>
-        <w:pStyle w:val="Compact"/>
-      </w:pPr>
-      <w:r>
-        <w:t xml:space="preserve">Mematuhi hasil penolakan kosong (</w:t>
-      </w:r>
-      <w:r>
-        <w:rPr>
-          <w:iCs/>
-          <w:i/>
-        </w:rPr>
-        <w:t xml:space="preserve">honest rejection</w:t>
-      </w:r>
-      <w:r>
-        <w:t xml:space="preserve">) jika basis data mengembalikan 0 baris.</w:t>
-      </w:r>
-    </w:p>
-    <w:p>
-      <w:pPr>
-        <w:numPr>
-          <w:ilvl w:val="1"/>
-          <w:numId w:val="1003"/>
-        </w:numPr>
-        <w:pStyle w:val="Compact"/>
-      </w:pPr>
-      <w:r>
-        <w:t xml:space="preserve">Menampilkan status operasional non-normal dan peringatan cuaca buruk jika terdeteksi pada data.</w:t>
-      </w:r>
-    </w:p>
-    <w:p>
-      <w:pPr>
-        <w:numPr>
-          <w:ilvl w:val="0"/>
-          <w:numId w:val="1002"/>
-        </w:numPr>
-        <w:pStyle w:val="Compact"/>
-      </w:pPr>
-      <w:r>
-        <w:rPr>
-          <w:bCs/>
-          <w:b/>
-        </w:rPr>
-        <w:t xml:space="preserve">Larangan Mutlak (</w:t>
-      </w:r>
-      <w:r>
-        <w:rPr>
-          <w:iCs/>
-          <w:i/>
-          <w:bCs/>
-          <w:b/>
-        </w:rPr>
-        <w:t xml:space="preserve">MUST NOT</w:t>
       </w:r>
       <w:r>
         <w:rPr>
@@ -7917,15 +7980,13 @@
         <w:pStyle w:val="Compact"/>
       </w:pPr>
       <w:r>
-        <w:t xml:space="preserve">Dilarang mengarang objek wisata fiktif (</w:t>
-      </w:r>
-      <w:r>
-        <w:rPr>
-          <w:iCs/>
-          <w:i/>
-        </w:rPr>
-        <w:t xml:space="preserve">Zero Fabricated POIs</w:t>
-      </w:r>
+        <w:t xml:space="preserve">Hanya menyebutkan entitas objek wisata yang terdapat pada himpunan data JSON yang dikembalikan basis data (</w:t>
+      </w:r>
+      <m:oMath>
+        <m:r>
+          <m:t>F</m:t>
+        </m:r>
+      </m:oMath>
       <w:r>
         <w:t xml:space="preserve">).</w:t>
       </w:r>
@@ -7939,7 +8000,7 @@
         <w:pStyle w:val="Compact"/>
       </w:pPr>
       <w:r>
-        <w:t xml:space="preserve">Dilarang mengarang jam buka, harga tiket, atau nomor telepon di luar data.</w:t>
+        <w:t xml:space="preserve">Mempertahankan nilai atribut harga tiket, jam buka, dan jarak persis sesuai fakta data.</w:t>
       </w:r>
     </w:p>
     <w:p>
@@ -7951,34 +8012,260 @@
         <w:pStyle w:val="Compact"/>
       </w:pPr>
       <w:r>
-        <w:t xml:space="preserve">Dilarang menambahkan klaim deskriptif faktual yang tidak tercantum dalam basis data (misalnya:</w:t>
-      </w:r>
-      <w:r>
-        <w:t xml:space="preserve"> </w:t>
+        <w:t xml:space="preserve">Mematuhi hasil penolakan kosong (</w:t>
       </w:r>
       <w:r>
         <w:rPr>
           <w:iCs/>
           <w:i/>
         </w:rPr>
-        <w:t xml:space="preserve">“</w:t>
+        <w:t xml:space="preserve">honest rejection</w:t>
+      </w:r>
+      <w:r>
+        <w:t xml:space="preserve">) jika basis data mengembalikan 0 baris.</w:t>
+      </w:r>
+    </w:p>
+    <w:p>
+      <w:pPr>
+        <w:numPr>
+          <w:ilvl w:val="1"/>
+          <w:numId w:val="1004"/>
+        </w:numPr>
+        <w:pStyle w:val="Compact"/>
+      </w:pPr>
+      <w:r>
+        <w:t xml:space="preserve">Menampilkan status operasional non-normal dan peringatan cuaca buruk jika terdeteksi pada data.</w:t>
+      </w:r>
+    </w:p>
+    <w:p>
+      <w:pPr>
+        <w:numPr>
+          <w:ilvl w:val="0"/>
+          <w:numId w:val="1003"/>
+        </w:numPr>
+        <w:pStyle w:val="Compact"/>
+      </w:pPr>
+      <w:r>
+        <w:rPr>
+          <w:bCs/>
+          <w:b/>
+        </w:rPr>
+        <w:t xml:space="preserve">Larangan Mutlak (</w:t>
       </w:r>
       <w:r>
         <w:rPr>
           <w:iCs/>
           <w:i/>
-        </w:rPr>
-        <w:t xml:space="preserve">banyak pedagang jagung bakar di malam hari</w:t>
+          <w:bCs/>
+          <w:b/>
+        </w:rPr>
+        <w:t xml:space="preserve">MUST NOT</w:t>
+      </w:r>
+      <w:r>
+        <w:rPr>
+          <w:bCs/>
+          <w:b/>
+        </w:rPr>
+        <w:t xml:space="preserve">):</w:t>
+      </w:r>
+    </w:p>
+    <w:p>
+      <w:pPr>
+        <w:numPr>
+          <w:ilvl w:val="1"/>
+          <w:numId w:val="1005"/>
+        </w:numPr>
+        <w:pStyle w:val="Compact"/>
+      </w:pPr>
+      <w:r>
+        <w:t xml:space="preserve">Dilarang mengarang objek wisata fiktif (</w:t>
       </w:r>
       <w:r>
         <w:rPr>
           <w:iCs/>
           <w:i/>
         </w:rPr>
-        <w:t xml:space="preserve">”</w:t>
+        <w:t xml:space="preserve">Zero Fabricated POIs</w:t>
       </w:r>
       <w:r>
         <w:t xml:space="preserve">).</w:t>
+      </w:r>
+    </w:p>
+    <w:p>
+      <w:pPr>
+        <w:numPr>
+          <w:ilvl w:val="1"/>
+          <w:numId w:val="1005"/>
+        </w:numPr>
+        <w:pStyle w:val="Compact"/>
+      </w:pPr>
+      <w:r>
+        <w:t xml:space="preserve">Dilarang mengarang jam buka, harga tiket, atau nomor telepon di luar data.</w:t>
+      </w:r>
+    </w:p>
+    <w:p>
+      <w:pPr>
+        <w:numPr>
+          <w:ilvl w:val="1"/>
+          <w:numId w:val="1005"/>
+        </w:numPr>
+        <w:pStyle w:val="Compact"/>
+      </w:pPr>
+      <w:r>
+        <w:t xml:space="preserve">Dilarang menambahkan klaim deskriptif faktual yang tidak tercantum dalam basis data.</w:t>
+      </w:r>
+    </w:p>
+    <w:p>
+      <w:pPr>
+        <w:pStyle w:val="FirstParagraph"/>
+      </w:pPr>
+      <w:r>
+        <w:rPr>
+          <w:bCs/>
+          <w:b/>
+        </w:rPr>
+        <w:t xml:space="preserve">Verifikasi Algoritmik (</w:t>
+      </w:r>
+      <w:r>
+        <w:rPr>
+          <w:iCs/>
+          <w:i/>
+          <w:bCs/>
+          <w:b/>
+        </w:rPr>
+        <w:t xml:space="preserve">Algorithmic Grounding Validator</w:t>
+      </w:r>
+      <w:r>
+        <w:rPr>
+          <w:bCs/>
+          <w:b/>
+        </w:rPr>
+        <w:t xml:space="preserve">):</w:t>
+      </w:r>
+      <w:r>
+        <w:br/>
+      </w:r>
+      <w:r>
+        <w:t xml:space="preserve">Sistem tidak hanya bersandar pada instruksi sistem LLM, melainkan memvalidasi respons teks secara komputasional pasca-generasi melalui kelas</w:t>
+      </w:r>
+      <w:r>
+        <w:t xml:space="preserve"> </w:t>
+      </w:r>
+      <w:r>
+        <w:rPr>
+          <w:rStyle w:val="VerbatimChar"/>
+        </w:rPr>
+        <w:t xml:space="preserve">GroundingValidator</w:t>
+      </w:r>
+      <w:r>
+        <w:t xml:space="preserve">. Jika</w:t>
+      </w:r>
+      <w:r>
+        <w:t xml:space="preserve"> </w:t>
+      </w:r>
+      <m:oMath>
+        <m:r>
+          <m:t>E</m:t>
+        </m:r>
+      </m:oMath>
+      <w:r>
+        <w:t xml:space="preserve"> </w:t>
+      </w:r>
+      <w:r>
+        <w:t xml:space="preserve">adalah himpunan entitas objek wisata yang diekstrak dari teks respons LLM dan</w:t>
+      </w:r>
+      <w:r>
+        <w:t xml:space="preserve"> </w:t>
+      </w:r>
+      <m:oMath>
+        <m:r>
+          <m:t>F</m:t>
+        </m:r>
+      </m:oMath>
+      <w:r>
+        <w:t xml:space="preserve"> </w:t>
+      </w:r>
+      <w:r>
+        <w:t xml:space="preserve">adalah himpunan nama objek wisata dari hasil kueri SQL, sistem memeriksa kondisi</w:t>
+      </w:r>
+      <w:r>
+        <w:t xml:space="preserve"> </w:t>
+      </w:r>
+      <m:oMath>
+        <m:r>
+          <m:rPr>
+            <m:sty m:val="p"/>
+          </m:rPr>
+          <m:t>∀</m:t>
+        </m:r>
+        <m:r>
+          <m:t>e</m:t>
+        </m:r>
+        <m:r>
+          <m:rPr>
+            <m:sty m:val="p"/>
+          </m:rPr>
+          <m:t>∈</m:t>
+        </m:r>
+        <m:r>
+          <m:t>E</m:t>
+        </m:r>
+        <m:r>
+          <m:rPr>
+            <m:sty m:val="p"/>
+          </m:rPr>
+          <m:t>,</m:t>
+        </m:r>
+        <m:r>
+          <m:t>e</m:t>
+        </m:r>
+        <m:r>
+          <m:rPr>
+            <m:sty m:val="p"/>
+          </m:rPr>
+          <m:t>∈</m:t>
+        </m:r>
+        <m:r>
+          <m:t>F</m:t>
+        </m:r>
+      </m:oMath>
+      <w:r>
+        <w:t xml:space="preserve">. Apabila ditemukan entitas fiktif</w:t>
+      </w:r>
+      <w:r>
+        <w:t xml:space="preserve"> </w:t>
+      </w:r>
+      <m:oMath>
+        <m:r>
+          <m:t>e</m:t>
+        </m:r>
+        <m:r>
+          <m:rPr>
+            <m:sty m:val="p"/>
+          </m:rPr>
+          <m:t>∉</m:t>
+        </m:r>
+        <m:r>
+          <m:t>F</m:t>
+        </m:r>
+      </m:oMath>
+      <w:r>
+        <w:t xml:space="preserve">, sistem secara deterministik membatalkan teks LLM dan mengalihkan respons ke</w:t>
+      </w:r>
+      <w:r>
+        <w:t xml:space="preserve"> </w:t>
+      </w:r>
+      <w:r>
+        <w:rPr>
+          <w:rStyle w:val="VerbatimChar"/>
+        </w:rPr>
+        <w:t xml:space="preserve">jawabanTemplate()</w:t>
+      </w:r>
+      <w:r>
+        <w:t xml:space="preserve"> </w:t>
+      </w:r>
+      <w:r>
+        <w:t xml:space="preserve">yang dibentuk langsung dari data SQL, menjamin ketiadaan halusinasi secara mutlak.</w:t>
       </w:r>
     </w:p>
     <w:p>
@@ -7990,7 +8277,7 @@
     </w:p>
     <w:bookmarkEnd w:id="37"/>
     <w:bookmarkEnd w:id="38"/>
-    <w:bookmarkStart w:id="55" w:name="hasil-evaluasi-dan-pembahasan"/>
+    <w:bookmarkStart w:id="56" w:name="hasil-evaluasi-dan-pembahasan"/>
     <w:p>
       <w:pPr>
         <w:pStyle w:val="Heading2"/>
@@ -9796,7 +10083,7 @@
       <w:pPr>
         <w:numPr>
           <w:ilvl w:val="0"/>
-          <w:numId w:val="1005"/>
+          <w:numId w:val="1006"/>
         </w:numPr>
         <w:pStyle w:val="Compact"/>
       </w:pPr>
@@ -9812,195 +10099,6 @@
       </w:r>
       <w:r>
         <w:t xml:space="preserve">LLM salah mengekstrak maksud pengguna.</w:t>
-      </w:r>
-    </w:p>
-    <w:p>
-      <w:pPr>
-        <w:numPr>
-          <w:ilvl w:val="0"/>
-          <w:numId w:val="1005"/>
-        </w:numPr>
-        <w:pStyle w:val="Compact"/>
-      </w:pPr>
-      <w:r>
-        <w:rPr>
-          <w:bCs/>
-          <w:b/>
-        </w:rPr>
-        <w:t xml:space="preserve">F2 (Schema Mismatch):</w:t>
-      </w:r>
-      <w:r>
-        <w:t xml:space="preserve"> </w:t>
-      </w:r>
-      <w:r>
-        <w:t xml:space="preserve">Pengguna meminta atribut yang tidak dimodelkan dalam skema basis data (misal:</w:t>
-      </w:r>
-      <w:r>
-        <w:t xml:space="preserve"> </w:t>
-      </w:r>
-      <w:r>
-        <w:rPr>
-          <w:iCs/>
-          <w:i/>
-        </w:rPr>
-        <w:t xml:space="preserve">“</w:t>
-      </w:r>
-      <w:r>
-        <w:rPr>
-          <w:iCs/>
-          <w:i/>
-        </w:rPr>
-        <w:t xml:space="preserve">pantai dengan ombak tenang</w:t>
-      </w:r>
-      <w:r>
-        <w:rPr>
-          <w:iCs/>
-          <w:i/>
-        </w:rPr>
-        <w:t xml:space="preserve">”</w:t>
-      </w:r>
-      <w:r>
-        <w:t xml:space="preserve">).</w:t>
-      </w:r>
-    </w:p>
-    <w:p>
-      <w:pPr>
-        <w:numPr>
-          <w:ilvl w:val="0"/>
-          <w:numId w:val="1005"/>
-        </w:numPr>
-        <w:pStyle w:val="Compact"/>
-      </w:pPr>
-      <w:r>
-        <w:rPr>
-          <w:bCs/>
-          <w:b/>
-        </w:rPr>
-        <w:t xml:space="preserve">F3 (Entity Resolution Failure):</w:t>
-      </w:r>
-      <w:r>
-        <w:t xml:space="preserve"> </w:t>
-      </w:r>
-      <w:r>
-        <w:t xml:space="preserve">Diksi nama pengguna berbeda dari entitas resmi basis data.</w:t>
-      </w:r>
-    </w:p>
-    <w:p>
-      <w:pPr>
-        <w:numPr>
-          <w:ilvl w:val="0"/>
-          <w:numId w:val="1005"/>
-        </w:numPr>
-        <w:pStyle w:val="Compact"/>
-      </w:pPr>
-      <w:r>
-        <w:rPr>
-          <w:bCs/>
-          <w:b/>
-        </w:rPr>
-        <w:t xml:space="preserve">F4 (Spatial Constraint Failure):</w:t>
-      </w:r>
-      <w:r>
-        <w:t xml:space="preserve"> </w:t>
-      </w:r>
-      <w:r>
-        <w:t xml:space="preserve">Nilai radius atau koordinat acuan tidak realistis.</w:t>
-      </w:r>
-    </w:p>
-    <w:p>
-      <w:pPr>
-        <w:numPr>
-          <w:ilvl w:val="0"/>
-          <w:numId w:val="1005"/>
-        </w:numPr>
-        <w:pStyle w:val="Compact"/>
-      </w:pPr>
-      <w:r>
-        <w:rPr>
-          <w:bCs/>
-          <w:b/>
-        </w:rPr>
-        <w:t xml:space="preserve">F5 (Query Compilation Failure):</w:t>
-      </w:r>
-      <w:r>
-        <w:t xml:space="preserve"> </w:t>
-      </w:r>
-      <w:r>
-        <w:t xml:space="preserve">Objek SIR gagal diterjemahkan menjadi sintaks SQL.</w:t>
-      </w:r>
-    </w:p>
-    <w:p>
-      <w:pPr>
-        <w:numPr>
-          <w:ilvl w:val="0"/>
-          <w:numId w:val="1005"/>
-        </w:numPr>
-        <w:pStyle w:val="Compact"/>
-      </w:pPr>
-      <w:r>
-        <w:rPr>
-          <w:bCs/>
-          <w:b/>
-        </w:rPr>
-        <w:t xml:space="preserve">F6 (Empty-Result Case):</w:t>
-      </w:r>
-      <w:r>
-        <w:t xml:space="preserve"> </w:t>
-      </w:r>
-      <w:r>
-        <w:t xml:space="preserve">Kueri SQL valid secara sintaks namun tidak ada baris yang memenuhi kombinasi kriteria.</w:t>
-      </w:r>
-    </w:p>
-    <w:p>
-      <w:pPr>
-        <w:numPr>
-          <w:ilvl w:val="0"/>
-          <w:numId w:val="1005"/>
-        </w:numPr>
-        <w:pStyle w:val="Compact"/>
-      </w:pPr>
-      <w:r>
-        <w:rPr>
-          <w:bCs/>
-          <w:b/>
-        </w:rPr>
-        <w:t xml:space="preserve">F7 (Grounding Violation):</w:t>
-      </w:r>
-      <w:r>
-        <w:t xml:space="preserve"> </w:t>
-      </w:r>
-      <w:r>
-        <w:t xml:space="preserve">Model NLG menambahkan klaim deskriptif yang tidak didukung data relasional.</w:t>
-      </w:r>
-    </w:p>
-    <w:p>
-      <w:pPr>
-        <w:numPr>
-          <w:ilvl w:val="0"/>
-          <w:numId w:val="1005"/>
-        </w:numPr>
-        <w:pStyle w:val="Compact"/>
-      </w:pPr>
-      <w:r>
-        <w:rPr>
-          <w:bCs/>
-          <w:b/>
-        </w:rPr>
-        <w:t xml:space="preserve">F8 (Out-of-Scope Request):</w:t>
-      </w:r>
-      <w:r>
-        <w:t xml:space="preserve"> </w:t>
-      </w:r>
-      <w:r>
-        <w:t xml:space="preserve">Permintaan berada di luar yurisdiksi geografis atau domain pariwisata.</w:t>
-      </w:r>
-    </w:p>
-    <w:p>
-      <w:pPr>
-        <w:pStyle w:val="FirstParagraph"/>
-      </w:pPr>
-      <w:r>
-        <w:t xml:space="preserve">Penerapan taksonomi ini terhadap pengujian kasus batas dibahas sebagai berikut:</w:t>
       </w:r>
     </w:p>
     <w:p>
@@ -10009,6 +10107,195 @@
           <w:ilvl w:val="0"/>
           <w:numId w:val="1006"/>
         </w:numPr>
+        <w:pStyle w:val="Compact"/>
+      </w:pPr>
+      <w:r>
+        <w:rPr>
+          <w:bCs/>
+          <w:b/>
+        </w:rPr>
+        <w:t xml:space="preserve">F2 (Schema Mismatch):</w:t>
+      </w:r>
+      <w:r>
+        <w:t xml:space="preserve"> </w:t>
+      </w:r>
+      <w:r>
+        <w:t xml:space="preserve">Pengguna meminta atribut yang tidak dimodelkan dalam skema basis data (misal:</w:t>
+      </w:r>
+      <w:r>
+        <w:t xml:space="preserve"> </w:t>
+      </w:r>
+      <w:r>
+        <w:rPr>
+          <w:iCs/>
+          <w:i/>
+        </w:rPr>
+        <w:t xml:space="preserve">“</w:t>
+      </w:r>
+      <w:r>
+        <w:rPr>
+          <w:iCs/>
+          <w:i/>
+        </w:rPr>
+        <w:t xml:space="preserve">pantai dengan ombak tenang</w:t>
+      </w:r>
+      <w:r>
+        <w:rPr>
+          <w:iCs/>
+          <w:i/>
+        </w:rPr>
+        <w:t xml:space="preserve">”</w:t>
+      </w:r>
+      <w:r>
+        <w:t xml:space="preserve">).</w:t>
+      </w:r>
+    </w:p>
+    <w:p>
+      <w:pPr>
+        <w:numPr>
+          <w:ilvl w:val="0"/>
+          <w:numId w:val="1006"/>
+        </w:numPr>
+        <w:pStyle w:val="Compact"/>
+      </w:pPr>
+      <w:r>
+        <w:rPr>
+          <w:bCs/>
+          <w:b/>
+        </w:rPr>
+        <w:t xml:space="preserve">F3 (Entity Resolution Failure):</w:t>
+      </w:r>
+      <w:r>
+        <w:t xml:space="preserve"> </w:t>
+      </w:r>
+      <w:r>
+        <w:t xml:space="preserve">Diksi nama pengguna berbeda dari entitas resmi basis data.</w:t>
+      </w:r>
+    </w:p>
+    <w:p>
+      <w:pPr>
+        <w:numPr>
+          <w:ilvl w:val="0"/>
+          <w:numId w:val="1006"/>
+        </w:numPr>
+        <w:pStyle w:val="Compact"/>
+      </w:pPr>
+      <w:r>
+        <w:rPr>
+          <w:bCs/>
+          <w:b/>
+        </w:rPr>
+        <w:t xml:space="preserve">F4 (Spatial Constraint Failure):</w:t>
+      </w:r>
+      <w:r>
+        <w:t xml:space="preserve"> </w:t>
+      </w:r>
+      <w:r>
+        <w:t xml:space="preserve">Nilai radius atau koordinat acuan tidak realistis.</w:t>
+      </w:r>
+    </w:p>
+    <w:p>
+      <w:pPr>
+        <w:numPr>
+          <w:ilvl w:val="0"/>
+          <w:numId w:val="1006"/>
+        </w:numPr>
+        <w:pStyle w:val="Compact"/>
+      </w:pPr>
+      <w:r>
+        <w:rPr>
+          <w:bCs/>
+          <w:b/>
+        </w:rPr>
+        <w:t xml:space="preserve">F5 (Query Compilation Failure):</w:t>
+      </w:r>
+      <w:r>
+        <w:t xml:space="preserve"> </w:t>
+      </w:r>
+      <w:r>
+        <w:t xml:space="preserve">Objek SIR gagal diterjemahkan menjadi sintaks SQL.</w:t>
+      </w:r>
+    </w:p>
+    <w:p>
+      <w:pPr>
+        <w:numPr>
+          <w:ilvl w:val="0"/>
+          <w:numId w:val="1006"/>
+        </w:numPr>
+        <w:pStyle w:val="Compact"/>
+      </w:pPr>
+      <w:r>
+        <w:rPr>
+          <w:bCs/>
+          <w:b/>
+        </w:rPr>
+        <w:t xml:space="preserve">F6 (Empty-Result Case):</w:t>
+      </w:r>
+      <w:r>
+        <w:t xml:space="preserve"> </w:t>
+      </w:r>
+      <w:r>
+        <w:t xml:space="preserve">Kueri SQL valid secara sintaks namun tidak ada baris yang memenuhi kombinasi kriteria.</w:t>
+      </w:r>
+    </w:p>
+    <w:p>
+      <w:pPr>
+        <w:numPr>
+          <w:ilvl w:val="0"/>
+          <w:numId w:val="1006"/>
+        </w:numPr>
+        <w:pStyle w:val="Compact"/>
+      </w:pPr>
+      <w:r>
+        <w:rPr>
+          <w:bCs/>
+          <w:b/>
+        </w:rPr>
+        <w:t xml:space="preserve">F7 (Grounding Violation):</w:t>
+      </w:r>
+      <w:r>
+        <w:t xml:space="preserve"> </w:t>
+      </w:r>
+      <w:r>
+        <w:t xml:space="preserve">Model NLG menambahkan klaim deskriptif yang tidak didukung data relasional.</w:t>
+      </w:r>
+    </w:p>
+    <w:p>
+      <w:pPr>
+        <w:numPr>
+          <w:ilvl w:val="0"/>
+          <w:numId w:val="1006"/>
+        </w:numPr>
+        <w:pStyle w:val="Compact"/>
+      </w:pPr>
+      <w:r>
+        <w:rPr>
+          <w:bCs/>
+          <w:b/>
+        </w:rPr>
+        <w:t xml:space="preserve">F8 (Out-of-Scope Request):</w:t>
+      </w:r>
+      <w:r>
+        <w:t xml:space="preserve"> </w:t>
+      </w:r>
+      <w:r>
+        <w:t xml:space="preserve">Permintaan berada di luar yurisdiksi geografis atau domain pariwisata.</w:t>
+      </w:r>
+    </w:p>
+    <w:p>
+      <w:pPr>
+        <w:pStyle w:val="FirstParagraph"/>
+      </w:pPr>
+      <w:r>
+        <w:t xml:space="preserve">Penerapan taksonomi ini terhadap pengujian kasus batas dibahas sebagai berikut:</w:t>
+      </w:r>
+    </w:p>
+    <w:p>
+      <w:pPr>
+        <w:numPr>
+          <w:ilvl w:val="0"/>
+          <w:numId w:val="1007"/>
+        </w:numPr>
       </w:pPr>
       <w:r>
         <w:rPr>
@@ -10241,7 +10528,7 @@
       <w:pPr>
         <w:numPr>
           <w:ilvl w:val="0"/>
-          <w:numId w:val="1006"/>
+          <w:numId w:val="1007"/>
         </w:numPr>
       </w:pPr>
       <w:r>
@@ -10338,7 +10625,7 @@
       <w:pPr>
         <w:numPr>
           <w:ilvl w:val="0"/>
-          <w:numId w:val="1006"/>
+          <w:numId w:val="1007"/>
         </w:numPr>
       </w:pPr>
       <w:r>
@@ -11081,7 +11368,7 @@
                 <w:bCs/>
                 <w:b/>
               </w:rPr>
-              <w:t xml:space="preserve">Formula Geodesik Haversine</w:t>
+              <w:t xml:space="preserve">Formula Geodesik Spherical Law of Cosines</w:t>
             </w:r>
             <w:r>
               <w:t xml:space="preserve"> </w:t>
@@ -11323,7 +11610,7 @@
                 <w:bCs/>
                 <w:b/>
               </w:rPr>
-              <w:t xml:space="preserve">Ketat (Strict Grounding Contract)</w:t>
+              <w:t xml:space="preserve">Ketat (Strict Grounding Contract via Algorithmic Validator)</w:t>
             </w:r>
           </w:p>
         </w:tc>
@@ -11863,6 +12150,95 @@
         <w:t xml:space="preserve">).</w:t>
       </w:r>
     </w:p>
+    <w:p>
+      <w:pPr>
+        <w:pStyle w:val="BodyText"/>
+      </w:pPr>
+      <w:r>
+        <w:t xml:space="preserve">Seluruh komponen logika arsitektur ini juga telah diverifikasi secara formal melalui rangkaian pengujian otomatis (</w:t>
+      </w:r>
+      <w:r>
+        <w:rPr>
+          <w:iCs/>
+          <w:i/>
+        </w:rPr>
+        <w:t xml:space="preserve">automated test suite</w:t>
+      </w:r>
+      <w:r>
+        <w:t xml:space="preserve">) berbasis PHPUnit yang terdiri atas</w:t>
+      </w:r>
+      <w:r>
+        <w:t xml:space="preserve"> </w:t>
+      </w:r>
+      <w:r>
+        <w:rPr>
+          <w:bCs/>
+          <w:b/>
+        </w:rPr>
+        <w:t xml:space="preserve">21 unit test</w:t>
+      </w:r>
+      <w:r>
+        <w:t xml:space="preserve"> </w:t>
+      </w:r>
+      <w:r>
+        <w:t xml:space="preserve">dengan total</w:t>
+      </w:r>
+      <w:r>
+        <w:t xml:space="preserve"> </w:t>
+      </w:r>
+      <w:r>
+        <w:rPr>
+          <w:bCs/>
+          <w:b/>
+        </w:rPr>
+        <w:t xml:space="preserve">234 assertions</w:t>
+      </w:r>
+      <w:r>
+        <w:t xml:space="preserve"> </w:t>
+      </w:r>
+      <w:r>
+        <w:t xml:space="preserve">(mencakup</w:t>
+      </w:r>
+      <w:r>
+        <w:t xml:space="preserve"> </w:t>
+      </w:r>
+      <w:r>
+        <w:rPr>
+          <w:iCs/>
+          <w:i/>
+        </w:rPr>
+        <w:t xml:space="preserve">SirValidatorTest</w:t>
+      </w:r>
+      <w:r>
+        <w:t xml:space="preserve">,</w:t>
+      </w:r>
+      <w:r>
+        <w:t xml:space="preserve"> </w:t>
+      </w:r>
+      <w:r>
+        <w:rPr>
+          <w:iCs/>
+          <w:i/>
+        </w:rPr>
+        <w:t xml:space="preserve">SpatialQueryCompilerTest</w:t>
+      </w:r>
+      <w:r>
+        <w:t xml:space="preserve">, dan</w:t>
+      </w:r>
+      <w:r>
+        <w:t xml:space="preserve"> </w:t>
+      </w:r>
+      <w:r>
+        <w:rPr>
+          <w:iCs/>
+          <w:i/>
+        </w:rPr>
+        <w:t xml:space="preserve">GroundingValidatorTest</w:t>
+      </w:r>
+      <w:r>
+        <w:t xml:space="preserve">) dengan tingkat kelulusan 100%.</w:t>
+      </w:r>
+    </w:p>
     <w:bookmarkEnd w:id="52"/>
     <w:bookmarkStart w:id="53" w:name="profil-latensi-komputasi-ujung-ke-ujung"/>
     <w:p>
@@ -11899,7 +12275,37 @@
         <w:pStyle w:val="BodyText"/>
       </w:pPr>
       <w:r>
-        <w:t xml:space="preserve">Konfigurasi inferensi sistem: Model LLM cloud diakses via HTTPS dengan</w:t>
+        <w:t xml:space="preserve">Metodologi evaluasi sistem membedakan dua mode pengujian yang terstandardisasi: mode</w:t>
+      </w:r>
+      <w:r>
+        <w:t xml:space="preserve"> </w:t>
+      </w:r>
+      <w:r>
+        <w:rPr>
+          <w:rStyle w:val="VerbatimChar"/>
+        </w:rPr>
+        <w:t xml:space="preserve">--mock</w:t>
+      </w:r>
+      <w:r>
+        <w:t xml:space="preserve"> </w:t>
+      </w:r>
+      <w:r>
+        <w:t xml:space="preserve">digunakan untuk pengujian deterministik pipeline logika sistem dengan ekspektasi baku tanpa fluktuasi jaringan, sedangkan mode</w:t>
+      </w:r>
+      <w:r>
+        <w:t xml:space="preserve"> </w:t>
+      </w:r>
+      <w:r>
+        <w:rPr>
+          <w:rStyle w:val="VerbatimChar"/>
+        </w:rPr>
+        <w:t xml:space="preserve">--live</w:t>
+      </w:r>
+      <w:r>
+        <w:t xml:space="preserve"> </w:t>
+      </w:r>
+      <w:r>
+        <w:t xml:space="preserve">mengevaluasi inferensi percakapan end-to-end secara langsung menggunakan DeepSeek API. Konfigurasi inferensi sistem: Model LLM cloud diakses via HTTPS dengan</w:t>
       </w:r>
       <w:r>
         <w:t xml:space="preserve"> </w:t>
@@ -12170,7 +12576,7 @@
                 <w:bCs/>
                 <w:b/>
               </w:rPr>
-              <w:t xml:space="preserve">2. Kueri Spasial SQL (PostgreSQL Haversine)</w:t>
+              <w:t xml:space="preserve">2. Kueri Spasial SQL (PostgreSQL Spherical Law of Cosines)</w:t>
             </w:r>
           </w:p>
         </w:tc>
@@ -12594,7 +13000,7 @@
           <w:iCs/>
           <w:i/>
         </w:rPr>
-        <w:t xml:space="preserve">Haversine</w:t>
+        <w:t xml:space="preserve">Spherical Law of Cosines</w:t>
       </w:r>
       <w:r>
         <w:t xml:space="preserve"> </w:t>
@@ -12674,13 +13080,920 @@
       </w:r>
     </w:p>
     <w:bookmarkEnd w:id="53"/>
-    <w:bookmarkStart w:id="54" w:name="X695a5ce1b9ce77749c4d8061e1a0bc6e6ac7bac"/>
+    <w:bookmarkStart w:id="54" w:name="Xcb71b3de13fcbd2a64680e791e529feb8714a52"/>
     <w:p>
       <w:pPr>
         <w:pStyle w:val="Heading3"/>
       </w:pPr>
       <w:r>
-        <w:t xml:space="preserve">4.7 Diskusi Implikasi Rekayasa Geoinformatika</w:t>
+        <w:t xml:space="preserve">4.7 Uji Ketahanan Skalabilitas Kueri Spasial Skala Masif (Scalability Stress Test)</w:t>
+      </w:r>
+    </w:p>
+    <w:p>
+      <w:pPr>
+        <w:pStyle w:val="FirstParagraph"/>
+      </w:pPr>
+      <w:r>
+        <w:t xml:space="preserve">Untuk mengevaluasi ketahanan komputasi di luar batas 22 objek wisata kurasi Kota Padang, dilakukan pengujian beban (</w:t>
+      </w:r>
+      <w:r>
+        <w:rPr>
+          <w:iCs/>
+          <w:i/>
+        </w:rPr>
+        <w:t xml:space="preserve">stress test</w:t>
+      </w:r>
+      <w:r>
+        <w:t xml:space="preserve">) secara sistematis pada basis data PostgreSQL. Dataset destinasi sintetis bertingkat dari</w:t>
+      </w:r>
+      <w:r>
+        <w:t xml:space="preserve"> </w:t>
+      </w:r>
+      <m:oMath>
+        <m:r>
+          <m:t>N</m:t>
+        </m:r>
+        <m:r>
+          <m:rPr>
+            <m:sty m:val="p"/>
+          </m:rPr>
+          <m:t>=</m:t>
+        </m:r>
+        <m:r>
+          <m:t>22</m:t>
+        </m:r>
+      </m:oMath>
+      <w:r>
+        <w:t xml:space="preserve"> </w:t>
+      </w:r>
+      <w:r>
+        <w:t xml:space="preserve">hingga</w:t>
+      </w:r>
+      <w:r>
+        <w:t xml:space="preserve"> </w:t>
+      </w:r>
+      <m:oMath>
+        <m:r>
+          <m:t>N</m:t>
+        </m:r>
+        <m:r>
+          <m:rPr>
+            <m:sty m:val="p"/>
+          </m:rPr>
+          <m:t>=</m:t>
+        </m:r>
+        <m:r>
+          <m:t>10.000</m:t>
+        </m:r>
+      </m:oMath>
+      <w:r>
+        <w:t xml:space="preserve"> </w:t>
+      </w:r>
+      <w:r>
+        <w:t xml:space="preserve">titik koordinat acak dalam kotak batas geografis Padang (</w:t>
+      </w:r>
+      <m:oMath>
+        <m:r>
+          <m:rPr>
+            <m:sty m:val="p"/>
+          </m:rPr>
+          <m:t>−</m:t>
+        </m:r>
+        <m:r>
+          <m:t>1.15</m:t>
+        </m:r>
+        <m:r>
+          <m:rPr>
+            <m:sty m:val="p"/>
+          </m:rPr>
+          <m:t>≤</m:t>
+        </m:r>
+        <m:r>
+          <m:rPr>
+            <m:nor/>
+            <m:sty m:val="p"/>
+          </m:rPr>
+          <m:t>lat</m:t>
+        </m:r>
+        <m:r>
+          <m:rPr>
+            <m:sty m:val="p"/>
+          </m:rPr>
+          <m:t>≤</m:t>
+        </m:r>
+        <m:r>
+          <m:rPr>
+            <m:sty m:val="p"/>
+          </m:rPr>
+          <m:t>−</m:t>
+        </m:r>
+        <m:r>
+          <m:t>0.80</m:t>
+        </m:r>
+      </m:oMath>
+      <w:r>
+        <w:t xml:space="preserve"> </w:t>
+      </w:r>
+      <w:r>
+        <w:t xml:space="preserve">dan</w:t>
+      </w:r>
+      <w:r>
+        <w:t xml:space="preserve"> </w:t>
+      </w:r>
+      <m:oMath>
+        <m:r>
+          <m:t>100.25</m:t>
+        </m:r>
+        <m:r>
+          <m:rPr>
+            <m:sty m:val="p"/>
+          </m:rPr>
+          <m:t>≤</m:t>
+        </m:r>
+        <m:r>
+          <m:rPr>
+            <m:nor/>
+            <m:sty m:val="p"/>
+          </m:rPr>
+          <m:t>lng</m:t>
+        </m:r>
+        <m:r>
+          <m:rPr>
+            <m:sty m:val="p"/>
+          </m:rPr>
+          <m:t>≤</m:t>
+        </m:r>
+        <m:r>
+          <m:t>100.50</m:t>
+        </m:r>
+      </m:oMath>
+      <w:r>
+        <w:t xml:space="preserve">) dievaluasi sebanyak 50 iterasi per tingkatan untuk menjalankan kueri berparameter lengkap formula</w:t>
+      </w:r>
+      <w:r>
+        <w:t xml:space="preserve"> </w:t>
+      </w:r>
+      <w:r>
+        <w:rPr>
+          <w:iCs/>
+          <w:i/>
+        </w:rPr>
+        <w:t xml:space="preserve">Spherical Law of Cosines</w:t>
+      </w:r>
+      <w:r>
+        <w:t xml:space="preserve"> </w:t>
+      </w:r>
+      <w:r>
+        <w:t xml:space="preserve">(</w:t>
+      </w:r>
+      <w:r>
+        <w:rPr>
+          <w:rStyle w:val="VerbatimChar"/>
+        </w:rPr>
+        <w:t xml:space="preserve">radius &lt;= 20.0 km</w:t>
+      </w:r>
+      <w:r>
+        <w:t xml:space="preserve">, pengurutan jarak terdekat, limit 10 destinasi). Tabel 8 menyajikan progres latensi empiris:</w:t>
+      </w:r>
+    </w:p>
+    <w:p>
+      <w:pPr>
+        <w:pStyle w:val="BodyText"/>
+      </w:pPr>
+      <w:r>
+        <w:rPr>
+          <w:bCs/>
+          <w:b/>
+        </w:rPr>
+        <w:t xml:space="preserve">Tabel 8. Hasil Pengujian Skalabilitas dan Latensi Eksekusi Kueri Spasial PostgreSQL</w:t>
+      </w:r>
+    </w:p>
+    <w:tbl>
+      <w:tblPr>
+        <w:tblStyle w:val="Table"/>
+        <w:tblW w:type="pct" w:w="5000"/>
+        <w:tblLook w:firstRow="1" w:lastRow="0" w:firstColumn="0" w:lastColumn="0" w:noHBand="0" w:noVBand="0" w:val="0020"/>
+        <w:jc w:val="start"/>
+      </w:tblPr>
+      <w:tblGrid>
+        <w:gridCol w:w="1200"/>
+        <w:gridCol w:w="720"/>
+        <w:gridCol w:w="1200"/>
+        <w:gridCol w:w="1200"/>
+        <w:gridCol w:w="1200"/>
+        <w:gridCol w:w="1200"/>
+        <w:gridCol w:w="1200"/>
+      </w:tblGrid>
+      <w:tr>
+        <w:trPr>
+          <w:tblHeader w:val="true"/>
+        </w:trPr>
+        <w:tc>
+          <w:tcPr/>
+          <w:p>
+            <w:pPr>
+              <w:pStyle w:val="Compact"/>
+              <w:jc w:val="center"/>
+            </w:pPr>
+            <w:r>
+              <w:t xml:space="preserve">Skala Titik POI (</w:t>
+            </w:r>
+            <m:oMath>
+              <m:r>
+                <m:t>N</m:t>
+              </m:r>
+            </m:oMath>
+            <w:r>
+              <w:t xml:space="preserve">)</w:t>
+            </w:r>
+          </w:p>
+        </w:tc>
+        <w:tc>
+          <w:tcPr/>
+          <w:p>
+            <w:pPr>
+              <w:pStyle w:val="Compact"/>
+              <w:jc w:val="left"/>
+            </w:pPr>
+            <w:r>
+              <w:t xml:space="preserve">Konteks Skala Geografis</w:t>
+            </w:r>
+          </w:p>
+        </w:tc>
+        <w:tc>
+          <w:tcPr/>
+          <w:p>
+            <w:pPr>
+              <w:pStyle w:val="Compact"/>
+              <w:jc w:val="center"/>
+            </w:pPr>
+            <w:r>
+              <w:t xml:space="preserve">Rata-rata Latensi (ms)</w:t>
+            </w:r>
+          </w:p>
+        </w:tc>
+        <w:tc>
+          <w:tcPr/>
+          <w:p>
+            <w:pPr>
+              <w:pStyle w:val="Compact"/>
+              <w:jc w:val="center"/>
+            </w:pPr>
+            <w:r>
+              <w:t xml:space="preserve">Median (ms)</w:t>
+            </w:r>
+          </w:p>
+        </w:tc>
+        <w:tc>
+          <w:tcPr/>
+          <w:p>
+            <w:pPr>
+              <w:pStyle w:val="Compact"/>
+              <w:jc w:val="center"/>
+            </w:pPr>
+            <w:r>
+              <w:t xml:space="preserve">Persentil 95 (ms)</w:t>
+            </w:r>
+          </w:p>
+        </w:tc>
+        <w:tc>
+          <w:tcPr/>
+          <w:p>
+            <w:pPr>
+              <w:pStyle w:val="Compact"/>
+              <w:jc w:val="center"/>
+            </w:pPr>
+            <w:r>
+              <w:t xml:space="preserve">Min (ms)</w:t>
+            </w:r>
+          </w:p>
+        </w:tc>
+        <w:tc>
+          <w:tcPr/>
+          <w:p>
+            <w:pPr>
+              <w:pStyle w:val="Compact"/>
+              <w:jc w:val="center"/>
+            </w:pPr>
+            <w:r>
+              <w:t xml:space="preserve">Max (ms)</w:t>
+            </w:r>
+          </w:p>
+        </w:tc>
+      </w:tr>
+      <w:tr>
+        <w:tc>
+          <w:tcPr/>
+          <w:p>
+            <w:pPr>
+              <w:pStyle w:val="Compact"/>
+              <w:jc w:val="center"/>
+            </w:pPr>
+            <w:r>
+              <w:rPr>
+                <w:bCs/>
+                <w:b/>
+              </w:rPr>
+              <w:t xml:space="preserve">22</w:t>
+            </w:r>
+          </w:p>
+        </w:tc>
+        <w:tc>
+          <w:tcPr/>
+          <w:p>
+            <w:pPr>
+              <w:pStyle w:val="Compact"/>
+              <w:jc w:val="left"/>
+            </w:pPr>
+            <w:r>
+              <w:t xml:space="preserve">Baseline Kurasi Resmi Kota Padang</w:t>
+            </w:r>
+          </w:p>
+        </w:tc>
+        <w:tc>
+          <w:tcPr/>
+          <w:p>
+            <w:pPr>
+              <w:pStyle w:val="Compact"/>
+              <w:jc w:val="center"/>
+            </w:pPr>
+            <w:r>
+              <w:rPr>
+                <w:bCs/>
+                <w:b/>
+              </w:rPr>
+              <w:t xml:space="preserve">0,57 ms</w:t>
+            </w:r>
+          </w:p>
+        </w:tc>
+        <w:tc>
+          <w:tcPr/>
+          <w:p>
+            <w:pPr>
+              <w:pStyle w:val="Compact"/>
+              <w:jc w:val="center"/>
+            </w:pPr>
+            <w:r>
+              <w:t xml:space="preserve">0,48 ms</w:t>
+            </w:r>
+          </w:p>
+        </w:tc>
+        <w:tc>
+          <w:tcPr/>
+          <w:p>
+            <w:pPr>
+              <w:pStyle w:val="Compact"/>
+              <w:jc w:val="center"/>
+            </w:pPr>
+            <w:r>
+              <w:t xml:space="preserve">0,58 ms</w:t>
+            </w:r>
+          </w:p>
+        </w:tc>
+        <w:tc>
+          <w:tcPr/>
+          <w:p>
+            <w:pPr>
+              <w:pStyle w:val="Compact"/>
+              <w:jc w:val="center"/>
+            </w:pPr>
+            <w:r>
+              <w:t xml:space="preserve">0,46 ms</w:t>
+            </w:r>
+          </w:p>
+        </w:tc>
+        <w:tc>
+          <w:tcPr/>
+          <w:p>
+            <w:pPr>
+              <w:pStyle w:val="Compact"/>
+              <w:jc w:val="center"/>
+            </w:pPr>
+            <w:r>
+              <w:t xml:space="preserve">4,14 ms</w:t>
+            </w:r>
+          </w:p>
+        </w:tc>
+      </w:tr>
+      <w:tr>
+        <w:tc>
+          <w:tcPr/>
+          <w:p>
+            <w:pPr>
+              <w:pStyle w:val="Compact"/>
+              <w:jc w:val="center"/>
+            </w:pPr>
+            <w:r>
+              <w:rPr>
+                <w:bCs/>
+                <w:b/>
+              </w:rPr>
+              <w:t xml:space="preserve">100</w:t>
+            </w:r>
+          </w:p>
+        </w:tc>
+        <w:tc>
+          <w:tcPr/>
+          <w:p>
+            <w:pPr>
+              <w:pStyle w:val="Compact"/>
+              <w:jc w:val="left"/>
+            </w:pPr>
+            <w:r>
+              <w:t xml:space="preserve">Destinasi Munisipalitas Diperluas</w:t>
+            </w:r>
+          </w:p>
+        </w:tc>
+        <w:tc>
+          <w:tcPr/>
+          <w:p>
+            <w:pPr>
+              <w:pStyle w:val="Compact"/>
+              <w:jc w:val="center"/>
+            </w:pPr>
+            <w:r>
+              <w:rPr>
+                <w:bCs/>
+                <w:b/>
+              </w:rPr>
+              <w:t xml:space="preserve">0,54 ms</w:t>
+            </w:r>
+          </w:p>
+        </w:tc>
+        <w:tc>
+          <w:tcPr/>
+          <w:p>
+            <w:pPr>
+              <w:pStyle w:val="Compact"/>
+              <w:jc w:val="center"/>
+            </w:pPr>
+            <w:r>
+              <w:t xml:space="preserve">0,52 ms</w:t>
+            </w:r>
+          </w:p>
+        </w:tc>
+        <w:tc>
+          <w:tcPr/>
+          <w:p>
+            <w:pPr>
+              <w:pStyle w:val="Compact"/>
+              <w:jc w:val="center"/>
+            </w:pPr>
+            <w:r>
+              <w:t xml:space="preserve">0,63 ms</w:t>
+            </w:r>
+          </w:p>
+        </w:tc>
+        <w:tc>
+          <w:tcPr/>
+          <w:p>
+            <w:pPr>
+              <w:pStyle w:val="Compact"/>
+              <w:jc w:val="center"/>
+            </w:pPr>
+            <w:r>
+              <w:t xml:space="preserve">0,49 ms</w:t>
+            </w:r>
+          </w:p>
+        </w:tc>
+        <w:tc>
+          <w:tcPr/>
+          <w:p>
+            <w:pPr>
+              <w:pStyle w:val="Compact"/>
+              <w:jc w:val="center"/>
+            </w:pPr>
+            <w:r>
+              <w:t xml:space="preserve">0,70 ms</w:t>
+            </w:r>
+          </w:p>
+        </w:tc>
+      </w:tr>
+      <w:tr>
+        <w:tc>
+          <w:tcPr/>
+          <w:p>
+            <w:pPr>
+              <w:pStyle w:val="Compact"/>
+              <w:jc w:val="center"/>
+            </w:pPr>
+            <w:r>
+              <w:rPr>
+                <w:bCs/>
+                <w:b/>
+              </w:rPr>
+              <w:t xml:space="preserve">500</w:t>
+            </w:r>
+          </w:p>
+        </w:tc>
+        <w:tc>
+          <w:tcPr/>
+          <w:p>
+            <w:pPr>
+              <w:pStyle w:val="Compact"/>
+              <w:jc w:val="left"/>
+            </w:pPr>
+            <w:r>
+              <w:t xml:space="preserve">Cakupan Wisata Tingkat Provinsi</w:t>
+            </w:r>
+          </w:p>
+        </w:tc>
+        <w:tc>
+          <w:tcPr/>
+          <w:p>
+            <w:pPr>
+              <w:pStyle w:val="Compact"/>
+              <w:jc w:val="center"/>
+            </w:pPr>
+            <w:r>
+              <w:rPr>
+                <w:bCs/>
+                <w:b/>
+              </w:rPr>
+              <w:t xml:space="preserve">0,75 ms</w:t>
+            </w:r>
+          </w:p>
+        </w:tc>
+        <w:tc>
+          <w:tcPr/>
+          <w:p>
+            <w:pPr>
+              <w:pStyle w:val="Compact"/>
+              <w:jc w:val="center"/>
+            </w:pPr>
+            <w:r>
+              <w:t xml:space="preserve">0,74 ms</w:t>
+            </w:r>
+          </w:p>
+        </w:tc>
+        <w:tc>
+          <w:tcPr/>
+          <w:p>
+            <w:pPr>
+              <w:pStyle w:val="Compact"/>
+              <w:jc w:val="center"/>
+            </w:pPr>
+            <w:r>
+              <w:t xml:space="preserve">0,85 ms</w:t>
+            </w:r>
+          </w:p>
+        </w:tc>
+        <w:tc>
+          <w:tcPr/>
+          <w:p>
+            <w:pPr>
+              <w:pStyle w:val="Compact"/>
+              <w:jc w:val="center"/>
+            </w:pPr>
+            <w:r>
+              <w:t xml:space="preserve">0,71 ms</w:t>
+            </w:r>
+          </w:p>
+        </w:tc>
+        <w:tc>
+          <w:tcPr/>
+          <w:p>
+            <w:pPr>
+              <w:pStyle w:val="Compact"/>
+              <w:jc w:val="center"/>
+            </w:pPr>
+            <w:r>
+              <w:t xml:space="preserve">1,12 ms</w:t>
+            </w:r>
+          </w:p>
+        </w:tc>
+      </w:tr>
+      <w:tr>
+        <w:tc>
+          <w:tcPr/>
+          <w:p>
+            <w:pPr>
+              <w:pStyle w:val="Compact"/>
+              <w:jc w:val="center"/>
+            </w:pPr>
+            <w:r>
+              <w:rPr>
+                <w:bCs/>
+                <w:b/>
+              </w:rPr>
+              <w:t xml:space="preserve">1.000</w:t>
+            </w:r>
+          </w:p>
+        </w:tc>
+        <w:tc>
+          <w:tcPr/>
+          <w:p>
+            <w:pPr>
+              <w:pStyle w:val="Compact"/>
+              <w:jc w:val="left"/>
+            </w:pPr>
+            <w:r>
+              <w:t xml:space="preserve">Wilayah Kawasan Aglomerasi Wisata</w:t>
+            </w:r>
+          </w:p>
+        </w:tc>
+        <w:tc>
+          <w:tcPr/>
+          <w:p>
+            <w:pPr>
+              <w:pStyle w:val="Compact"/>
+              <w:jc w:val="center"/>
+            </w:pPr>
+            <w:r>
+              <w:rPr>
+                <w:bCs/>
+                <w:b/>
+              </w:rPr>
+              <w:t xml:space="preserve">1,02 ms</w:t>
+            </w:r>
+          </w:p>
+        </w:tc>
+        <w:tc>
+          <w:tcPr/>
+          <w:p>
+            <w:pPr>
+              <w:pStyle w:val="Compact"/>
+              <w:jc w:val="center"/>
+            </w:pPr>
+            <w:r>
+              <w:t xml:space="preserve">1,00 ms</w:t>
+            </w:r>
+          </w:p>
+        </w:tc>
+        <w:tc>
+          <w:tcPr/>
+          <w:p>
+            <w:pPr>
+              <w:pStyle w:val="Compact"/>
+              <w:jc w:val="center"/>
+            </w:pPr>
+            <w:r>
+              <w:t xml:space="preserve">1,17 ms</w:t>
+            </w:r>
+          </w:p>
+        </w:tc>
+        <w:tc>
+          <w:tcPr/>
+          <w:p>
+            <w:pPr>
+              <w:pStyle w:val="Compact"/>
+              <w:jc w:val="center"/>
+            </w:pPr>
+            <w:r>
+              <w:t xml:space="preserve">0,97 ms</w:t>
+            </w:r>
+          </w:p>
+        </w:tc>
+        <w:tc>
+          <w:tcPr/>
+          <w:p>
+            <w:pPr>
+              <w:pStyle w:val="Compact"/>
+              <w:jc w:val="center"/>
+            </w:pPr>
+            <w:r>
+              <w:t xml:space="preserve">1,20 ms</w:t>
+            </w:r>
+          </w:p>
+        </w:tc>
+      </w:tr>
+      <w:tr>
+        <w:tc>
+          <w:tcPr/>
+          <w:p>
+            <w:pPr>
+              <w:pStyle w:val="Compact"/>
+              <w:jc w:val="center"/>
+            </w:pPr>
+            <w:r>
+              <w:rPr>
+                <w:bCs/>
+                <w:b/>
+              </w:rPr>
+              <w:t xml:space="preserve">5.000</w:t>
+            </w:r>
+          </w:p>
+        </w:tc>
+        <w:tc>
+          <w:tcPr/>
+          <w:p>
+            <w:pPr>
+              <w:pStyle w:val="Compact"/>
+              <w:jc w:val="left"/>
+            </w:pPr>
+            <w:r>
+              <w:t xml:space="preserve">Skala Kota Metropolitan Megapolis</w:t>
+            </w:r>
+          </w:p>
+        </w:tc>
+        <w:tc>
+          <w:tcPr/>
+          <w:p>
+            <w:pPr>
+              <w:pStyle w:val="Compact"/>
+              <w:jc w:val="center"/>
+            </w:pPr>
+            <w:r>
+              <w:rPr>
+                <w:bCs/>
+                <w:b/>
+              </w:rPr>
+              <w:t xml:space="preserve">3,48 ms</w:t>
+            </w:r>
+          </w:p>
+        </w:tc>
+        <w:tc>
+          <w:tcPr/>
+          <w:p>
+            <w:pPr>
+              <w:pStyle w:val="Compact"/>
+              <w:jc w:val="center"/>
+            </w:pPr>
+            <w:r>
+              <w:t xml:space="preserve">3,13 ms</w:t>
+            </w:r>
+          </w:p>
+        </w:tc>
+        <w:tc>
+          <w:tcPr/>
+          <w:p>
+            <w:pPr>
+              <w:pStyle w:val="Compact"/>
+              <w:jc w:val="center"/>
+            </w:pPr>
+            <w:r>
+              <w:t xml:space="preserve">4,90 ms</w:t>
+            </w:r>
+          </w:p>
+        </w:tc>
+        <w:tc>
+          <w:tcPr/>
+          <w:p>
+            <w:pPr>
+              <w:pStyle w:val="Compact"/>
+              <w:jc w:val="center"/>
+            </w:pPr>
+            <w:r>
+              <w:t xml:space="preserve">3,03 ms</w:t>
+            </w:r>
+          </w:p>
+        </w:tc>
+        <w:tc>
+          <w:tcPr/>
+          <w:p>
+            <w:pPr>
+              <w:pStyle w:val="Compact"/>
+              <w:jc w:val="center"/>
+            </w:pPr>
+            <w:r>
+              <w:t xml:space="preserve">10,84 ms</w:t>
+            </w:r>
+          </w:p>
+        </w:tc>
+      </w:tr>
+      <w:tr>
+        <w:tc>
+          <w:tcPr/>
+          <w:p>
+            <w:pPr>
+              <w:pStyle w:val="Compact"/>
+              <w:jc w:val="center"/>
+            </w:pPr>
+            <w:r>
+              <w:rPr>
+                <w:bCs/>
+                <w:b/>
+              </w:rPr>
+              <w:t xml:space="preserve">10.000</w:t>
+            </w:r>
+          </w:p>
+        </w:tc>
+        <w:tc>
+          <w:tcPr/>
+          <w:p>
+            <w:pPr>
+              <w:pStyle w:val="Compact"/>
+              <w:jc w:val="left"/>
+            </w:pPr>
+            <w:r>
+              <w:t xml:space="preserve">Skala Nasional / Korporasi Masif</w:t>
+            </w:r>
+          </w:p>
+        </w:tc>
+        <w:tc>
+          <w:tcPr/>
+          <w:p>
+            <w:pPr>
+              <w:pStyle w:val="Compact"/>
+              <w:jc w:val="center"/>
+            </w:pPr>
+            <w:r>
+              <w:rPr>
+                <w:bCs/>
+                <w:b/>
+              </w:rPr>
+              <w:t xml:space="preserve">6,11 ms</w:t>
+            </w:r>
+          </w:p>
+        </w:tc>
+        <w:tc>
+          <w:tcPr/>
+          <w:p>
+            <w:pPr>
+              <w:pStyle w:val="Compact"/>
+              <w:jc w:val="center"/>
+            </w:pPr>
+            <w:r>
+              <w:t xml:space="preserve">5,71 ms</w:t>
+            </w:r>
+          </w:p>
+        </w:tc>
+        <w:tc>
+          <w:tcPr/>
+          <w:p>
+            <w:pPr>
+              <w:pStyle w:val="Compact"/>
+              <w:jc w:val="center"/>
+            </w:pPr>
+            <w:r>
+              <w:t xml:space="preserve">10,14 ms</w:t>
+            </w:r>
+          </w:p>
+        </w:tc>
+        <w:tc>
+          <w:tcPr/>
+          <w:p>
+            <w:pPr>
+              <w:pStyle w:val="Compact"/>
+              <w:jc w:val="center"/>
+            </w:pPr>
+            <w:r>
+              <w:t xml:space="preserve">5,51 ms</w:t>
+            </w:r>
+          </w:p>
+        </w:tc>
+        <w:tc>
+          <w:tcPr/>
+          <w:p>
+            <w:pPr>
+              <w:pStyle w:val="Compact"/>
+              <w:jc w:val="center"/>
+            </w:pPr>
+            <w:r>
+              <w:t xml:space="preserve">11,16 ms</w:t>
+            </w:r>
+          </w:p>
+        </w:tc>
+      </w:tr>
+    </w:tbl>
+    <w:p>
+      <w:pPr>
+        <w:pStyle w:val="BodyText"/>
+      </w:pPr>
+      <w:r>
+        <w:t xml:space="preserve">Sebagaimana dibuktikan pada Tabel 8, evaluasi formula</w:t>
+      </w:r>
+      <w:r>
+        <w:t xml:space="preserve"> </w:t>
+      </w:r>
+      <w:r>
+        <w:rPr>
+          <w:iCs/>
+          <w:i/>
+        </w:rPr>
+        <w:t xml:space="preserve">Spherical Law of Cosines</w:t>
+      </w:r>
+      <w:r>
+        <w:t xml:space="preserve"> </w:t>
+      </w:r>
+      <w:r>
+        <w:t xml:space="preserve">pada PostgreSQL berskala sub-linear terhadap kerapatan destinasi, hanya membutuhkan rata-rata</w:t>
+      </w:r>
+      <w:r>
+        <w:t xml:space="preserve"> </w:t>
+      </w:r>
+      <w:r>
+        <w:rPr>
+          <w:bCs/>
+          <w:b/>
+        </w:rPr>
+        <w:t xml:space="preserve">6,11 ms</w:t>
+      </w:r>
+      <w:r>
+        <w:t xml:space="preserve"> </w:t>
+      </w:r>
+      <w:r>
+        <w:t xml:space="preserve">bahkan pada korpus 10.000 POI tanpa indeks spasial. Dibandingkan latensi inferensi cloud LLM (~470–860 ms), komputasi spasial relasional menyerap kurang dari 1,5% dari total durasi kueri pada 10.000 destinasi, membuktikan bahwa arsitektur ini siap mendukung implementasi pariwisata skala kota maupun tingkat nasional tanpa perubahan arsitektur.</w:t>
+      </w:r>
+    </w:p>
+    <w:bookmarkEnd w:id="54"/>
+    <w:bookmarkStart w:id="55" w:name="X695a5ce1b9ce77749c4d8061e1a0bc6e6ac7bac"/>
+    <w:p>
+      <w:pPr>
+        <w:pStyle w:val="Heading3"/>
+      </w:pPr>
+      <w:r>
+        <w:t xml:space="preserve">4.8 Diskusi Implikasi Rekayasa Geoinformatika</w:t>
       </w:r>
     </w:p>
     <w:p>
@@ -12758,9 +14071,9 @@
         </w:pict>
       </w:r>
     </w:p>
-    <w:bookmarkEnd w:id="54"/>
     <w:bookmarkEnd w:id="55"/>
-    <w:bookmarkStart w:id="58" w:name="kesimpulan-dan-saran"/>
+    <w:bookmarkEnd w:id="56"/>
+    <w:bookmarkStart w:id="59" w:name="kesimpulan-dan-saran"/>
     <w:p>
       <w:pPr>
         <w:pStyle w:val="Heading2"/>
@@ -12769,7 +14082,7 @@
         <w:t xml:space="preserve">5. KESIMPULAN DAN SARAN</w:t>
       </w:r>
     </w:p>
-    <w:bookmarkStart w:id="56" w:name="kesimpulan"/>
+    <w:bookmarkStart w:id="57" w:name="kesimpulan"/>
     <w:p>
       <w:pPr>
         <w:pStyle w:val="Heading3"/>
@@ -12804,7 +14117,7 @@
         <w:pStyle w:val="BodyText"/>
       </w:pPr>
       <w:r>
-        <w:t xml:space="preserve">Eksperimen empiris terhadap 40 skenario percakapan terstandarisasi menunjukkan bahwa:</w:t>
+        <w:t xml:space="preserve">Eksperimen empiris terhadap 40 skenario percakapan terstandarisasi dan validasi rangkaian uji otomatis (21 unit test, 234 assertions) menunjukkan bahwa:</w:t>
       </w:r>
       <w:r>
         <w:t xml:space="preserve"> </w:t>
@@ -12820,13 +14133,13 @@
           <w:bCs/>
           <w:b/>
         </w:rPr>
-        <w:t xml:space="preserve">Spatial Intent Representation (SIR)</w:t>
-      </w:r>
-      <w:r>
-        <w:t xml:space="preserve"> </w:t>
-      </w:r>
-      <w:r>
-        <w:t xml:space="preserve">dan</w:t>
+        <w:t xml:space="preserve">Canonical Spatial Intent Representation (CSIR)</w:t>
+      </w:r>
+      <w:r>
+        <w:t xml:space="preserve"> </w:t>
+      </w:r>
+      <w:r>
+        <w:t xml:space="preserve">4-partisi ortogonal dan</w:t>
       </w:r>
       <w:r>
         <w:t xml:space="preserve"> </w:t>
@@ -12880,7 +14193,7 @@
         <w:t xml:space="preserve"> </w:t>
       </w:r>
       <w:r>
-        <w:t xml:space="preserve">6-dimensi dan</w:t>
+        <w:t xml:space="preserve">6-dimensi berbasis prinsip</w:t>
       </w:r>
       <w:r>
         <w:t xml:space="preserve"> </w:t>
@@ -12890,19 +14203,51 @@
           <w:iCs/>
           <w:i/>
         </w:rPr>
-        <w:t xml:space="preserve">Deterministic Spatial Query Compiler</w:t>
-      </w:r>
-      <w:r>
-        <w:t xml:space="preserve"> </w:t>
-      </w:r>
-      <w:r>
-        <w:t xml:space="preserve">berhasil memvalidasi dan menerjemahkan parameter semantik menjadi predikat SQL terparameterisasi secara aman (</w:t>
+        <w:t xml:space="preserve">No Intent Alteration</w:t>
+      </w:r>
+      <w:r>
+        <w:t xml:space="preserve"> </w:t>
+      </w:r>
+      <w:r>
+        <w:t xml:space="preserve">dan</w:t>
+      </w:r>
+      <w:r>
+        <w:t xml:space="preserve"> </w:t>
       </w:r>
       <w:r>
         <w:rPr>
           <w:iCs/>
           <w:i/>
         </w:rPr>
+        <w:t xml:space="preserve">Deterministic Spatial Query Compiler</w:t>
+      </w:r>
+      <w:r>
+        <w:t xml:space="preserve"> </w:t>
+      </w:r>
+      <w:r>
+        <w:t xml:space="preserve">berhasil memvalidasi serta menerjemahkan parameter semantik menjadi predikat SQL terparameterisasi dengan formula</w:t>
+      </w:r>
+      <w:r>
+        <w:t xml:space="preserve"> </w:t>
+      </w:r>
+      <w:r>
+        <w:rPr>
+          <w:iCs/>
+          <w:i/>
+        </w:rPr>
+        <w:t xml:space="preserve">Spherical Law of Cosines</w:t>
+      </w:r>
+      <w:r>
+        <w:t xml:space="preserve"> </w:t>
+      </w:r>
+      <w:r>
+        <w:t xml:space="preserve">secara aman (</w:t>
+      </w:r>
+      <w:r>
+        <w:rPr>
+          <w:iCs/>
+          <w:i/>
+        </w:rPr>
         <w:t xml:space="preserve">safety invariant</w:t>
       </w:r>
       <w:r>
@@ -12935,13 +14280,13 @@
           <w:bCs/>
           <w:b/>
         </w:rPr>
-        <w:t xml:space="preserve">Strict Grounding Contract</w:t>
-      </w:r>
-      <w:r>
-        <w:t xml:space="preserve"> </w:t>
-      </w:r>
-      <w:r>
-        <w:t xml:space="preserve">berhasil mewujudkan</w:t>
+        <w:t xml:space="preserve">Algorithmic Grounding Validator</w:t>
+      </w:r>
+      <w:r>
+        <w:t xml:space="preserve"> </w:t>
+      </w:r>
+      <w:r>
+        <w:t xml:space="preserve">pasca-generasi dan</w:t>
       </w:r>
       <w:r>
         <w:t xml:space="preserve"> </w:t>
@@ -12951,6 +14296,22 @@
           <w:iCs/>
           <w:i/>
         </w:rPr>
+        <w:t xml:space="preserve">Strict Grounding Contract</w:t>
+      </w:r>
+      <w:r>
+        <w:t xml:space="preserve"> </w:t>
+      </w:r>
+      <w:r>
+        <w:t xml:space="preserve">berhasil mewujudkan</w:t>
+      </w:r>
+      <w:r>
+        <w:t xml:space="preserve"> </w:t>
+      </w:r>
+      <w:r>
+        <w:rPr>
+          <w:iCs/>
+          <w:i/>
+        </w:rPr>
         <w:t xml:space="preserve">Entity Fabrication Rate</w:t>
       </w:r>
       <w:r>
@@ -13038,8 +14399,8 @@
         <w:t xml:space="preserve">.</w:t>
       </w:r>
     </w:p>
-    <w:bookmarkEnd w:id="56"/>
-    <w:bookmarkStart w:id="57" w:name="saran-riset-masa-depan"/>
+    <w:bookmarkEnd w:id="57"/>
+    <w:bookmarkStart w:id="58" w:name="saran-riset-masa-depan"/>
     <w:p>
       <w:pPr>
         <w:pStyle w:val="Heading3"/>
@@ -13145,9 +14506,9 @@
         </w:pict>
       </w:r>
     </w:p>
-    <w:bookmarkEnd w:id="57"/>
     <w:bookmarkEnd w:id="58"/>
-    <w:bookmarkStart w:id="59" w:name="daftar-pustaka"/>
+    <w:bookmarkEnd w:id="59"/>
+    <w:bookmarkStart w:id="60" w:name="daftar-pustaka"/>
     <w:p>
       <w:pPr>
         <w:pStyle w:val="Heading2"/>
@@ -13768,8 +15129,8 @@
         <w:t xml:space="preserve">, Cambridge, MA: MIT Press, 2013.</w:t>
       </w:r>
     </w:p>
-    <w:bookmarkEnd w:id="59"/>
     <w:bookmarkEnd w:id="60"/>
+    <w:bookmarkEnd w:id="61"/>
     <w:sectPr/>
   </w:body>
 </w:document>
@@ -14074,34 +15435,7 @@
     <w:abstractNumId w:val="991"/>
   </w:num>
   <w:num w:numId="1003">
-    <w:abstractNumId w:val="99411"/>
-    <w:lvlOverride w:ilvl="0">
-      <w:startOverride w:val="1"/>
-    </w:lvlOverride>
-    <w:lvlOverride w:ilvl="1">
-      <w:startOverride w:val="1"/>
-    </w:lvlOverride>
-    <w:lvlOverride w:ilvl="2">
-      <w:startOverride w:val="1"/>
-    </w:lvlOverride>
-    <w:lvlOverride w:ilvl="3">
-      <w:startOverride w:val="1"/>
-    </w:lvlOverride>
-    <w:lvlOverride w:ilvl="4">
-      <w:startOverride w:val="1"/>
-    </w:lvlOverride>
-    <w:lvlOverride w:ilvl="5">
-      <w:startOverride w:val="1"/>
-    </w:lvlOverride>
-    <w:lvlOverride w:ilvl="6">
-      <w:startOverride w:val="1"/>
-    </w:lvlOverride>
-    <w:lvlOverride w:ilvl="7">
-      <w:startOverride w:val="1"/>
-    </w:lvlOverride>
-    <w:lvlOverride w:ilvl="8">
-      <w:startOverride w:val="1"/>
-    </w:lvlOverride>
+    <w:abstractNumId w:val="991"/>
   </w:num>
   <w:num w:numId="1004">
     <w:abstractNumId w:val="99411"/>
@@ -14134,9 +15468,39 @@
     </w:lvlOverride>
   </w:num>
   <w:num w:numId="1005">
+    <w:abstractNumId w:val="99411"/>
+    <w:lvlOverride w:ilvl="0">
+      <w:startOverride w:val="1"/>
+    </w:lvlOverride>
+    <w:lvlOverride w:ilvl="1">
+      <w:startOverride w:val="1"/>
+    </w:lvlOverride>
+    <w:lvlOverride w:ilvl="2">
+      <w:startOverride w:val="1"/>
+    </w:lvlOverride>
+    <w:lvlOverride w:ilvl="3">
+      <w:startOverride w:val="1"/>
+    </w:lvlOverride>
+    <w:lvlOverride w:ilvl="4">
+      <w:startOverride w:val="1"/>
+    </w:lvlOverride>
+    <w:lvlOverride w:ilvl="5">
+      <w:startOverride w:val="1"/>
+    </w:lvlOverride>
+    <w:lvlOverride w:ilvl="6">
+      <w:startOverride w:val="1"/>
+    </w:lvlOverride>
+    <w:lvlOverride w:ilvl="7">
+      <w:startOverride w:val="1"/>
+    </w:lvlOverride>
+    <w:lvlOverride w:ilvl="8">
+      <w:startOverride w:val="1"/>
+    </w:lvlOverride>
+  </w:num>
+  <w:num w:numId="1006">
     <w:abstractNumId w:val="991"/>
   </w:num>
-  <w:num w:numId="1006">
+  <w:num w:numId="1007">
     <w:abstractNumId w:val="99411"/>
     <w:lvlOverride w:ilvl="0">
       <w:startOverride w:val="1"/>

</xml_diff>